<commit_message>
Update conclusions docx; add Office temp files
Modify Conclusiones_Clave_Equipo48_V2.docx (binary changes) and add two new Office temporary files: ~$Presentacion_E6_v3_FINAL_Equipo48.pptx and ~$eech_v4_FINAL_Equipo48.docx. These look like editor temp files and may be accidental — consider removing them and adding appropriate Office temp patterns to .gitignore to prevent future commits.
</commit_message>
<xml_diff>
--- a/docs/Conclusiones_Clave_Equipo48_V2.docx
+++ b/docs/Conclusiones_Clave_Equipo48_V2.docx
@@ -3316,10 +3316,7 @@
     </w:p>
     <w:p>
       <w:pPr>
-        <w:pBdr>
-          <w:bottom w:val="single" w:sz="6" w:space="1" w:color="003987"/>
-        </w:pBdr>
-        <w:spacing w:before="360" w:after="80"/>
+        <w:spacing w:before="240" w:after="60"/>
         <w:rPr>
           <w:lang w:val="es-ES"/>
         </w:rPr>
@@ -3329,10 +3326,10 @@
           <w:rFonts w:ascii="Calibri" w:hAnsi="Calibri"/>
           <w:b/>
           <w:color w:val="003987"/>
-          <w:sz w:val="28"/>
-          <w:lang w:val="es-ES"/>
-        </w:rPr>
-        <w:t>3. Objetivo 4.2 — Medidas y Decisiones Específicas</w:t>
+          <w:sz w:val="24"/>
+          <w:lang w:val="es-ES"/>
+        </w:rPr>
+        <w:t>2.5 Riesgos Residuales</w:t>
       </w:r>
     </w:p>
     <w:p>
@@ -3349,25 +3346,7 @@
           <w:color w:val="000000"/>
           <w:lang w:val="es-ES"/>
         </w:rPr>
-        <w:t>A partir de los hallazgos obtenidos durante el modelado (E3–E5), se identifican las medidas concretas que deben tomarse para garantizar el éxito del proyecto en producción.</w:t>
-      </w:r>
-    </w:p>
-    <w:p>
-      <w:pPr>
-        <w:spacing w:before="240" w:after="60"/>
-        <w:rPr>
-          <w:lang w:val="es-ES"/>
-        </w:rPr>
-      </w:pPr>
-      <w:r>
-        <w:rPr>
-          <w:rFonts w:ascii="Calibri" w:hAnsi="Calibri"/>
-          <w:b/>
-          <w:color w:val="003987"/>
-          <w:sz w:val="24"/>
-          <w:lang w:val="es-ES"/>
-        </w:rPr>
-        <w:t>3.1 Modelo y ML</w:t>
+        <w:t>Tras aplicar las medidas de mitigación documentadas en el plan de gestión de riesgos (E4–E5), los riesgos residuales identificados son los siguientes:</w:t>
       </w:r>
     </w:p>
     <w:tbl>
@@ -3378,10 +3357,10 @@
         <w:tblLook w:val="04A0" w:firstRow="1" w:lastRow="0" w:firstColumn="1" w:lastColumn="0" w:noHBand="0" w:noVBand="1"/>
       </w:tblPr>
       <w:tblGrid>
-        <w:gridCol w:w="4252"/>
-        <w:gridCol w:w="1247"/>
-        <w:gridCol w:w="1701"/>
-        <w:gridCol w:w="1417"/>
+        <w:gridCol w:w="1500"/>
+        <w:gridCol w:w="2996"/>
+        <w:gridCol w:w="1000"/>
+        <w:gridCol w:w="3854"/>
       </w:tblGrid>
       <w:tr>
         <w:trPr>
@@ -3389,14 +3368,12 @@
         </w:trPr>
         <w:tc>
           <w:tcPr>
-            <w:tcW w:w="4252" w:type="dxa"/>
+            <w:tcW w:w="1500" w:type="dxa"/>
             <w:shd w:val="clear" w:color="auto" w:fill="003987"/>
-            <w:vAlign w:val="center"/>
-          </w:tcPr>
-          <w:p>
-            <w:pPr>
-              <w:spacing w:before="60" w:after="60"/>
-              <w:jc w:val="center"/>
+          </w:tcPr>
+          <w:p>
+            <w:pPr>
+              <w:spacing w:before="40" w:after="40"/>
               <w:rPr>
                 <w:lang w:val="es-ES"/>
               </w:rPr>
@@ -3409,20 +3386,18 @@
                 <w:sz w:val="20"/>
                 <w:lang w:val="es-ES"/>
               </w:rPr>
-              <w:t>Acción</w:t>
-            </w:r>
-          </w:p>
-        </w:tc>
-        <w:tc>
-          <w:tcPr>
-            <w:tcW w:w="1247" w:type="dxa"/>
+              <w:t>Riesgo</w:t>
+            </w:r>
+          </w:p>
+        </w:tc>
+        <w:tc>
+          <w:tcPr>
+            <w:tcW w:w="3000" w:type="dxa"/>
             <w:shd w:val="clear" w:color="auto" w:fill="003987"/>
-            <w:vAlign w:val="center"/>
-          </w:tcPr>
-          <w:p>
-            <w:pPr>
-              <w:spacing w:before="60" w:after="60"/>
-              <w:jc w:val="center"/>
+          </w:tcPr>
+          <w:p>
+            <w:pPr>
+              <w:spacing w:before="40" w:after="40"/>
               <w:rPr>
                 <w:lang w:val="es-ES"/>
               </w:rPr>
@@ -3435,20 +3410,18 @@
                 <w:sz w:val="20"/>
                 <w:lang w:val="es-ES"/>
               </w:rPr>
-              <w:t>Prioridad</w:t>
-            </w:r>
-          </w:p>
-        </w:tc>
-        <w:tc>
-          <w:tcPr>
-            <w:tcW w:w="1701" w:type="dxa"/>
+              <w:t>Medida de mitigación aplicada</w:t>
+            </w:r>
+          </w:p>
+        </w:tc>
+        <w:tc>
+          <w:tcPr>
+            <w:tcW w:w="1000" w:type="dxa"/>
             <w:shd w:val="clear" w:color="auto" w:fill="003987"/>
-            <w:vAlign w:val="center"/>
-          </w:tcPr>
-          <w:p>
-            <w:pPr>
-              <w:spacing w:before="60" w:after="60"/>
-              <w:jc w:val="center"/>
+          </w:tcPr>
+          <w:p>
+            <w:pPr>
+              <w:spacing w:before="40" w:after="40"/>
               <w:rPr>
                 <w:lang w:val="es-ES"/>
               </w:rPr>
@@ -3461,20 +3434,18 @@
                 <w:sz w:val="20"/>
                 <w:lang w:val="es-ES"/>
               </w:rPr>
-              <w:t>Responsable</w:t>
-            </w:r>
-          </w:p>
-        </w:tc>
-        <w:tc>
-          <w:tcPr>
-            <w:tcW w:w="1417" w:type="dxa"/>
+              <w:t>Nivel residual</w:t>
+            </w:r>
+          </w:p>
+        </w:tc>
+        <w:tc>
+          <w:tcPr>
+            <w:tcW w:w="3860" w:type="dxa"/>
             <w:shd w:val="clear" w:color="auto" w:fill="003987"/>
-            <w:vAlign w:val="center"/>
-          </w:tcPr>
-          <w:p>
-            <w:pPr>
-              <w:spacing w:before="60" w:after="60"/>
-              <w:jc w:val="center"/>
+          </w:tcPr>
+          <w:p>
+            <w:pPr>
+              <w:spacing w:before="40" w:after="40"/>
               <w:rPr>
                 <w:lang w:val="es-ES"/>
               </w:rPr>
@@ -3487,7 +3458,7 @@
                 <w:sz w:val="20"/>
                 <w:lang w:val="es-ES"/>
               </w:rPr>
-              <w:t>Plazo</w:t>
+              <w:t>Acción de seguimiento</w:t>
             </w:r>
           </w:p>
         </w:tc>
@@ -3498,100 +3469,89 @@
         </w:trPr>
         <w:tc>
           <w:tcPr>
-            <w:tcW w:w="4252" w:type="dxa"/>
-            <w:shd w:val="clear" w:color="auto" w:fill="FFFFFF"/>
-            <w:vAlign w:val="center"/>
-          </w:tcPr>
-          <w:p>
-            <w:pPr>
-              <w:spacing w:before="40" w:after="40"/>
-              <w:rPr>
-                <w:lang w:val="es-ES"/>
-              </w:rPr>
-            </w:pPr>
-            <w:r>
-              <w:rPr>
-                <w:rFonts w:ascii="Calibri" w:hAnsi="Calibri"/>
-                <w:color w:val="000000"/>
-                <w:sz w:val="20"/>
-                <w:lang w:val="es-ES"/>
-              </w:rPr>
-              <w:t>Desplegar Stacking-E5 (pipeline_final_e5.pkl) como modelo de producción</w:t>
-            </w:r>
-          </w:p>
-        </w:tc>
-        <w:tc>
-          <w:tcPr>
-            <w:tcW w:w="1247" w:type="dxa"/>
-            <w:shd w:val="clear" w:color="auto" w:fill="FFFFFF"/>
-            <w:vAlign w:val="center"/>
-          </w:tcPr>
-          <w:p>
-            <w:pPr>
-              <w:spacing w:before="40" w:after="40"/>
-              <w:jc w:val="center"/>
-              <w:rPr>
-                <w:lang w:val="es-ES"/>
-              </w:rPr>
-            </w:pPr>
-            <w:r>
-              <w:rPr>
-                <w:rFonts w:ascii="Calibri" w:hAnsi="Calibri"/>
-                <w:b/>
-                <w:color w:val="CC3333"/>
-                <w:sz w:val="20"/>
-                <w:lang w:val="es-ES"/>
-              </w:rPr>
-              <w:t>Alta</w:t>
-            </w:r>
-          </w:p>
-        </w:tc>
-        <w:tc>
-          <w:tcPr>
-            <w:tcW w:w="1701" w:type="dxa"/>
-            <w:shd w:val="clear" w:color="auto" w:fill="FFFFFF"/>
-            <w:vAlign w:val="center"/>
-          </w:tcPr>
-          <w:p>
-            <w:pPr>
-              <w:spacing w:before="40" w:after="40"/>
-              <w:rPr>
-                <w:lang w:val="es-ES"/>
-              </w:rPr>
-            </w:pPr>
-            <w:r>
-              <w:rPr>
-                <w:rFonts w:ascii="Calibri" w:hAnsi="Calibri"/>
-                <w:color w:val="000000"/>
-                <w:sz w:val="20"/>
-                <w:lang w:val="es-ES"/>
-              </w:rPr>
-              <w:t>Equipo ML</w:t>
-            </w:r>
-          </w:p>
-        </w:tc>
-        <w:tc>
-          <w:tcPr>
-            <w:tcW w:w="1417" w:type="dxa"/>
-            <w:shd w:val="clear" w:color="auto" w:fill="FFFFFF"/>
-            <w:vAlign w:val="center"/>
-          </w:tcPr>
-          <w:p>
-            <w:pPr>
-              <w:spacing w:before="40" w:after="40"/>
-              <w:jc w:val="center"/>
-              <w:rPr>
-                <w:lang w:val="es-ES"/>
-              </w:rPr>
-            </w:pPr>
-            <w:r>
-              <w:rPr>
-                <w:rFonts w:ascii="Calibri" w:hAnsi="Calibri"/>
-                <w:color w:val="000000"/>
-                <w:sz w:val="20"/>
-                <w:lang w:val="es-ES"/>
-              </w:rPr>
-              <w:t>Inmediato</w:t>
+            <w:tcW w:w="1500" w:type="dxa"/>
+          </w:tcPr>
+          <w:p>
+            <w:pPr>
+              <w:spacing w:before="40" w:after="40"/>
+              <w:rPr>
+                <w:lang w:val="es-ES"/>
+              </w:rPr>
+            </w:pPr>
+            <w:r>
+              <w:rPr>
+                <w:rFonts w:ascii="Calibri" w:hAnsi="Calibri"/>
+                <w:color w:val="000000"/>
+                <w:sz w:val="20"/>
+                <w:lang w:val="es-ES"/>
+              </w:rPr>
+              <w:t>Drift del modelo</w:t>
+            </w:r>
+          </w:p>
+        </w:tc>
+        <w:tc>
+          <w:tcPr>
+            <w:tcW w:w="3000" w:type="dxa"/>
+          </w:tcPr>
+          <w:p>
+            <w:pPr>
+              <w:spacing w:before="40" w:after="40"/>
+              <w:rPr>
+                <w:lang w:val="es-ES"/>
+              </w:rPr>
+            </w:pPr>
+            <w:r>
+              <w:rPr>
+                <w:rFonts w:ascii="Calibri" w:hAnsi="Calibri"/>
+                <w:color w:val="000000"/>
+                <w:sz w:val="20"/>
+                <w:lang w:val="es-ES"/>
+              </w:rPr>
+              <w:t>Monitoreo KS mensual + retrain automático trimestral</w:t>
+            </w:r>
+          </w:p>
+        </w:tc>
+        <w:tc>
+          <w:tcPr>
+            <w:tcW w:w="1000" w:type="dxa"/>
+          </w:tcPr>
+          <w:p>
+            <w:pPr>
+              <w:spacing w:before="40" w:after="40"/>
+              <w:rPr>
+                <w:lang w:val="es-ES"/>
+              </w:rPr>
+            </w:pPr>
+            <w:r>
+              <w:rPr>
+                <w:rFonts w:ascii="Calibri" w:hAnsi="Calibri"/>
+                <w:color w:val="000000"/>
+                <w:sz w:val="20"/>
+                <w:lang w:val="es-ES"/>
+              </w:rPr>
+              <w:t>BAJO</w:t>
+            </w:r>
+          </w:p>
+        </w:tc>
+        <w:tc>
+          <w:tcPr>
+            <w:tcW w:w="3860" w:type="dxa"/>
+          </w:tcPr>
+          <w:p>
+            <w:pPr>
+              <w:spacing w:before="40" w:after="40"/>
+              <w:rPr>
+                <w:lang w:val="es-ES"/>
+              </w:rPr>
+            </w:pPr>
+            <w:r>
+              <w:rPr>
+                <w:rFonts w:ascii="Calibri" w:hAnsi="Calibri"/>
+                <w:color w:val="000000"/>
+                <w:sz w:val="20"/>
+                <w:lang w:val="es-ES"/>
+              </w:rPr>
+              <w:t>Revisar dashboards mensualmente; retrain si KS p &lt; 0.05</w:t>
             </w:r>
           </w:p>
         </w:tc>
@@ -3602,100 +3562,89 @@
         </w:trPr>
         <w:tc>
           <w:tcPr>
-            <w:tcW w:w="4252" w:type="dxa"/>
-            <w:shd w:val="clear" w:color="auto" w:fill="F4F6FA"/>
-            <w:vAlign w:val="center"/>
-          </w:tcPr>
-          <w:p>
-            <w:pPr>
-              <w:spacing w:before="40" w:after="40"/>
-              <w:rPr>
-                <w:lang w:val="es-ES"/>
-              </w:rPr>
-            </w:pPr>
-            <w:r>
-              <w:rPr>
-                <w:rFonts w:ascii="Calibri" w:hAnsi="Calibri"/>
-                <w:color w:val="000000"/>
-                <w:sz w:val="20"/>
-                <w:lang w:val="es-ES"/>
-              </w:rPr>
-              <w:t>Implementar reentrenamiento trimestral con datos recientes (Q1–Q4)</w:t>
-            </w:r>
-          </w:p>
-        </w:tc>
-        <w:tc>
-          <w:tcPr>
-            <w:tcW w:w="1247" w:type="dxa"/>
-            <w:shd w:val="clear" w:color="auto" w:fill="F4F6FA"/>
-            <w:vAlign w:val="center"/>
-          </w:tcPr>
-          <w:p>
-            <w:pPr>
-              <w:spacing w:before="40" w:after="40"/>
-              <w:jc w:val="center"/>
-              <w:rPr>
-                <w:lang w:val="es-ES"/>
-              </w:rPr>
-            </w:pPr>
-            <w:r>
-              <w:rPr>
-                <w:rFonts w:ascii="Calibri" w:hAnsi="Calibri"/>
-                <w:b/>
-                <w:color w:val="CC3333"/>
-                <w:sz w:val="20"/>
-                <w:lang w:val="es-ES"/>
-              </w:rPr>
-              <w:t>Alta</w:t>
-            </w:r>
-          </w:p>
-        </w:tc>
-        <w:tc>
-          <w:tcPr>
-            <w:tcW w:w="1701" w:type="dxa"/>
-            <w:shd w:val="clear" w:color="auto" w:fill="F4F6FA"/>
-            <w:vAlign w:val="center"/>
-          </w:tcPr>
-          <w:p>
-            <w:pPr>
-              <w:spacing w:before="40" w:after="40"/>
-              <w:rPr>
-                <w:lang w:val="es-ES"/>
-              </w:rPr>
-            </w:pPr>
-            <w:r>
-              <w:rPr>
-                <w:rFonts w:ascii="Calibri" w:hAnsi="Calibri"/>
-                <w:color w:val="000000"/>
-                <w:sz w:val="20"/>
-                <w:lang w:val="es-ES"/>
-              </w:rPr>
-              <w:t>Equipo ML</w:t>
-            </w:r>
-          </w:p>
-        </w:tc>
-        <w:tc>
-          <w:tcPr>
-            <w:tcW w:w="1417" w:type="dxa"/>
-            <w:shd w:val="clear" w:color="auto" w:fill="F4F6FA"/>
-            <w:vAlign w:val="center"/>
-          </w:tcPr>
-          <w:p>
-            <w:pPr>
-              <w:spacing w:before="40" w:after="40"/>
-              <w:jc w:val="center"/>
-              <w:rPr>
-                <w:lang w:val="es-ES"/>
-              </w:rPr>
-            </w:pPr>
-            <w:r>
-              <w:rPr>
-                <w:rFonts w:ascii="Calibri" w:hAnsi="Calibri"/>
-                <w:color w:val="000000"/>
-                <w:sz w:val="20"/>
-                <w:lang w:val="es-ES"/>
-              </w:rPr>
-              <w:t>Trimestral</w:t>
+            <w:tcW w:w="1500" w:type="dxa"/>
+          </w:tcPr>
+          <w:p>
+            <w:pPr>
+              <w:spacing w:before="40" w:after="40"/>
+              <w:rPr>
+                <w:lang w:val="es-ES"/>
+              </w:rPr>
+            </w:pPr>
+            <w:r>
+              <w:rPr>
+                <w:rFonts w:ascii="Calibri" w:hAnsi="Calibri"/>
+                <w:color w:val="000000"/>
+                <w:sz w:val="20"/>
+                <w:lang w:val="es-ES"/>
+              </w:rPr>
+              <w:t>Fallo del servicio GCP</w:t>
+            </w:r>
+          </w:p>
+        </w:tc>
+        <w:tc>
+          <w:tcPr>
+            <w:tcW w:w="3000" w:type="dxa"/>
+          </w:tcPr>
+          <w:p>
+            <w:pPr>
+              <w:spacing w:before="40" w:after="40"/>
+              <w:rPr>
+                <w:lang w:val="es-ES"/>
+              </w:rPr>
+            </w:pPr>
+            <w:r>
+              <w:rPr>
+                <w:rFonts w:ascii="Calibri" w:hAnsi="Calibri"/>
+                <w:color w:val="000000"/>
+                <w:sz w:val="20"/>
+                <w:lang w:val="es-ES"/>
+              </w:rPr>
+              <w:t>SLOs definidos + runbooks + rollback &lt; 10 min</w:t>
+            </w:r>
+          </w:p>
+        </w:tc>
+        <w:tc>
+          <w:tcPr>
+            <w:tcW w:w="1000" w:type="dxa"/>
+          </w:tcPr>
+          <w:p>
+            <w:pPr>
+              <w:spacing w:before="40" w:after="40"/>
+              <w:rPr>
+                <w:lang w:val="es-ES"/>
+              </w:rPr>
+            </w:pPr>
+            <w:r>
+              <w:rPr>
+                <w:rFonts w:ascii="Calibri" w:hAnsi="Calibri"/>
+                <w:color w:val="000000"/>
+                <w:sz w:val="20"/>
+                <w:lang w:val="es-ES"/>
+              </w:rPr>
+              <w:t>BAJO</w:t>
+            </w:r>
+          </w:p>
+        </w:tc>
+        <w:tc>
+          <w:tcPr>
+            <w:tcW w:w="3860" w:type="dxa"/>
+          </w:tcPr>
+          <w:p>
+            <w:pPr>
+              <w:spacing w:before="40" w:after="40"/>
+              <w:rPr>
+                <w:lang w:val="es-ES"/>
+              </w:rPr>
+            </w:pPr>
+            <w:r>
+              <w:rPr>
+                <w:rFonts w:ascii="Calibri" w:hAnsi="Calibri"/>
+                <w:color w:val="000000"/>
+                <w:sz w:val="20"/>
+                <w:lang w:val="es-ES"/>
+              </w:rPr>
+              <w:t>Postmortem tras cada incidente P1/P2</w:t>
             </w:r>
           </w:p>
         </w:tc>
@@ -3706,46 +3655,108 @@
         </w:trPr>
         <w:tc>
           <w:tcPr>
-            <w:tcW w:w="4252" w:type="dxa"/>
-            <w:shd w:val="clear" w:color="auto" w:fill="FFFFFF"/>
-            <w:vAlign w:val="center"/>
-          </w:tcPr>
-          <w:p>
-            <w:pPr>
-              <w:spacing w:before="40" w:after="40"/>
-              <w:rPr>
-                <w:lang w:val="es-ES"/>
-              </w:rPr>
-            </w:pPr>
-            <w:r>
-              <w:rPr>
-                <w:rFonts w:ascii="Calibri" w:hAnsi="Calibri"/>
-                <w:color w:val="000000"/>
-                <w:sz w:val="20"/>
-                <w:lang w:val="es-ES"/>
-              </w:rPr>
-              <w:t xml:space="preserve">Monitoreo KS mensual — </w:t>
-            </w:r>
-            <w:proofErr w:type="spellStart"/>
-            <w:r>
-              <w:rPr>
-                <w:rFonts w:ascii="Calibri" w:hAnsi="Calibri"/>
-                <w:color w:val="000000"/>
-                <w:sz w:val="20"/>
-                <w:lang w:val="es-ES"/>
-              </w:rPr>
-              <w:t>trigger</w:t>
-            </w:r>
-            <w:proofErr w:type="spellEnd"/>
-            <w:r>
-              <w:rPr>
-                <w:rFonts w:ascii="Calibri" w:hAnsi="Calibri"/>
-                <w:color w:val="000000"/>
-                <w:sz w:val="20"/>
-                <w:lang w:val="es-ES"/>
-              </w:rPr>
-              <w:t xml:space="preserve"> automático si p </w:t>
-            </w:r>
+            <w:tcW w:w="1500" w:type="dxa"/>
+          </w:tcPr>
+          <w:p>
+            <w:pPr>
+              <w:spacing w:before="40" w:after="40"/>
+              <w:rPr>
+                <w:lang w:val="es-ES"/>
+              </w:rPr>
+            </w:pPr>
+            <w:r>
+              <w:rPr>
+                <w:rFonts w:ascii="Calibri" w:hAnsi="Calibri"/>
+                <w:color w:val="000000"/>
+                <w:sz w:val="20"/>
+                <w:lang w:val="es-ES"/>
+              </w:rPr>
+              <w:t>Baja adopción en campo</w:t>
+            </w:r>
+          </w:p>
+        </w:tc>
+        <w:tc>
+          <w:tcPr>
+            <w:tcW w:w="3000" w:type="dxa"/>
+          </w:tcPr>
+          <w:p>
+            <w:pPr>
+              <w:spacing w:before="40" w:after="40"/>
+              <w:rPr>
+                <w:lang w:val="es-ES"/>
+              </w:rPr>
+            </w:pPr>
+            <w:r>
+              <w:rPr>
+                <w:rFonts w:ascii="Calibri" w:hAnsi="Calibri"/>
+                <w:color w:val="000000"/>
+                <w:sz w:val="20"/>
+                <w:lang w:val="es-ES"/>
+              </w:rPr>
+              <w:t>Workshops + 2 semanas de soporte acompañado post-entrega</w:t>
+            </w:r>
+          </w:p>
+        </w:tc>
+        <w:tc>
+          <w:tcPr>
+            <w:tcW w:w="1000" w:type="dxa"/>
+          </w:tcPr>
+          <w:p>
+            <w:pPr>
+              <w:spacing w:before="40" w:after="40"/>
+              <w:rPr>
+                <w:lang w:val="es-ES"/>
+              </w:rPr>
+            </w:pPr>
+            <w:r>
+              <w:rPr>
+                <w:rFonts w:ascii="Calibri" w:hAnsi="Calibri"/>
+                <w:color w:val="000000"/>
+                <w:sz w:val="20"/>
+                <w:lang w:val="es-ES"/>
+              </w:rPr>
+              <w:t>MEDIO</w:t>
+            </w:r>
+          </w:p>
+        </w:tc>
+        <w:tc>
+          <w:tcPr>
+            <w:tcW w:w="3860" w:type="dxa"/>
+          </w:tcPr>
+          <w:p>
+            <w:pPr>
+              <w:spacing w:before="40" w:after="40"/>
+              <w:rPr>
+                <w:lang w:val="es-ES"/>
+              </w:rPr>
+            </w:pPr>
+            <w:r>
+              <w:rPr>
+                <w:rFonts w:ascii="Calibri" w:hAnsi="Calibri"/>
+                <w:color w:val="000000"/>
+                <w:sz w:val="20"/>
+                <w:lang w:val="es-ES"/>
+              </w:rPr>
+              <w:t>Encuesta de satisfacción semana 4; sesión de refuerzo si &lt; 70%</w:t>
+            </w:r>
+          </w:p>
+        </w:tc>
+      </w:tr>
+      <w:tr>
+        <w:trPr>
+          <w:jc w:val="center"/>
+        </w:trPr>
+        <w:tc>
+          <w:tcPr>
+            <w:tcW w:w="1500" w:type="dxa"/>
+          </w:tcPr>
+          <w:p>
+            <w:pPr>
+              <w:spacing w:before="40" w:after="40"/>
+              <w:rPr>
+                <w:lang w:val="es-ES"/>
+              </w:rPr>
+            </w:pPr>
             <w:r>
               <w:rPr>
                 <w:rFonts w:ascii="Calibri" w:hAnsi="Calibri"/>
@@ -3754,83 +3765,166 @@
                 <w:lang w:val="es-ES"/>
               </w:rPr>
               <w:lastRenderedPageBreak/>
-              <w:t>&lt; 0.05</w:t>
-            </w:r>
-          </w:p>
-        </w:tc>
-        <w:tc>
-          <w:tcPr>
-            <w:tcW w:w="1247" w:type="dxa"/>
-            <w:shd w:val="clear" w:color="auto" w:fill="FFFFFF"/>
-            <w:vAlign w:val="center"/>
-          </w:tcPr>
-          <w:p>
-            <w:pPr>
-              <w:spacing w:before="40" w:after="40"/>
-              <w:jc w:val="center"/>
-              <w:rPr>
-                <w:lang w:val="es-ES"/>
-              </w:rPr>
-            </w:pPr>
-            <w:r>
-              <w:rPr>
-                <w:rFonts w:ascii="Calibri" w:hAnsi="Calibri"/>
-                <w:b/>
-                <w:color w:val="CC3333"/>
-                <w:sz w:val="20"/>
-                <w:lang w:val="es-ES"/>
-              </w:rPr>
-              <w:lastRenderedPageBreak/>
-              <w:t>Alta</w:t>
-            </w:r>
-          </w:p>
-        </w:tc>
-        <w:tc>
-          <w:tcPr>
-            <w:tcW w:w="1701" w:type="dxa"/>
-            <w:shd w:val="clear" w:color="auto" w:fill="FFFFFF"/>
-            <w:vAlign w:val="center"/>
-          </w:tcPr>
-          <w:p>
-            <w:pPr>
-              <w:spacing w:before="40" w:after="40"/>
-              <w:rPr>
-                <w:lang w:val="es-ES"/>
-              </w:rPr>
-            </w:pPr>
-            <w:r>
-              <w:rPr>
-                <w:rFonts w:ascii="Calibri" w:hAnsi="Calibri"/>
-                <w:color w:val="000000"/>
-                <w:sz w:val="20"/>
-                <w:lang w:val="es-ES"/>
-              </w:rPr>
-              <w:t>Equipo ML</w:t>
-            </w:r>
-          </w:p>
-        </w:tc>
-        <w:tc>
-          <w:tcPr>
-            <w:tcW w:w="1417" w:type="dxa"/>
-            <w:shd w:val="clear" w:color="auto" w:fill="FFFFFF"/>
-            <w:vAlign w:val="center"/>
-          </w:tcPr>
-          <w:p>
-            <w:pPr>
-              <w:spacing w:before="40" w:after="40"/>
-              <w:jc w:val="center"/>
-              <w:rPr>
-                <w:lang w:val="es-ES"/>
-              </w:rPr>
-            </w:pPr>
-            <w:r>
-              <w:rPr>
-                <w:rFonts w:ascii="Calibri" w:hAnsi="Calibri"/>
-                <w:color w:val="000000"/>
-                <w:sz w:val="20"/>
-                <w:lang w:val="es-ES"/>
-              </w:rPr>
-              <w:t>Mensual</w:t>
+              <w:t>Datos de razas minoritarias</w:t>
+            </w:r>
+          </w:p>
+        </w:tc>
+        <w:tc>
+          <w:tcPr>
+            <w:tcW w:w="3000" w:type="dxa"/>
+          </w:tcPr>
+          <w:p>
+            <w:pPr>
+              <w:spacing w:before="40" w:after="40"/>
+              <w:rPr>
+                <w:lang w:val="es-ES"/>
+              </w:rPr>
+            </w:pPr>
+            <w:r>
+              <w:rPr>
+                <w:rFonts w:ascii="Calibri" w:hAnsi="Calibri"/>
+                <w:color w:val="000000"/>
+                <w:sz w:val="20"/>
+                <w:lang w:val="es-ES"/>
+              </w:rPr>
+              <w:t>Plan de ampliación a ≥ 200 registros por raza (Sprint 2)</w:t>
+            </w:r>
+          </w:p>
+        </w:tc>
+        <w:tc>
+          <w:tcPr>
+            <w:tcW w:w="1000" w:type="dxa"/>
+          </w:tcPr>
+          <w:p>
+            <w:pPr>
+              <w:spacing w:before="40" w:after="40"/>
+              <w:rPr>
+                <w:lang w:val="es-ES"/>
+              </w:rPr>
+            </w:pPr>
+            <w:r>
+              <w:rPr>
+                <w:rFonts w:ascii="Calibri" w:hAnsi="Calibri"/>
+                <w:color w:val="000000"/>
+                <w:sz w:val="20"/>
+                <w:lang w:val="es-ES"/>
+              </w:rPr>
+              <w:t>MEDIO</w:t>
+            </w:r>
+          </w:p>
+        </w:tc>
+        <w:tc>
+          <w:tcPr>
+            <w:tcW w:w="3860" w:type="dxa"/>
+          </w:tcPr>
+          <w:p>
+            <w:pPr>
+              <w:spacing w:before="40" w:after="40"/>
+              <w:rPr>
+                <w:lang w:val="es-ES"/>
+              </w:rPr>
+            </w:pPr>
+            <w:r>
+              <w:rPr>
+                <w:rFonts w:ascii="Calibri" w:hAnsi="Calibri"/>
+                <w:color w:val="000000"/>
+                <w:sz w:val="20"/>
+                <w:lang w:val="es-ES"/>
+              </w:rPr>
+              <w:t>Revisión de muestra al cierre del Sprint 2</w:t>
+            </w:r>
+          </w:p>
+        </w:tc>
+      </w:tr>
+      <w:tr>
+        <w:trPr>
+          <w:jc w:val="center"/>
+        </w:trPr>
+        <w:tc>
+          <w:tcPr>
+            <w:tcW w:w="1500" w:type="dxa"/>
+          </w:tcPr>
+          <w:p>
+            <w:pPr>
+              <w:spacing w:before="40" w:after="40"/>
+              <w:rPr>
+                <w:lang w:val="es-ES"/>
+              </w:rPr>
+            </w:pPr>
+            <w:r>
+              <w:rPr>
+                <w:rFonts w:ascii="Calibri" w:hAnsi="Calibri"/>
+                <w:color w:val="000000"/>
+                <w:sz w:val="20"/>
+                <w:lang w:val="es-ES"/>
+              </w:rPr>
+              <w:t>Cambio regulatorio LFPDPPP</w:t>
+            </w:r>
+          </w:p>
+        </w:tc>
+        <w:tc>
+          <w:tcPr>
+            <w:tcW w:w="3000" w:type="dxa"/>
+          </w:tcPr>
+          <w:p>
+            <w:pPr>
+              <w:spacing w:before="40" w:after="40"/>
+              <w:rPr>
+                <w:lang w:val="es-ES"/>
+              </w:rPr>
+            </w:pPr>
+            <w:r>
+              <w:rPr>
+                <w:rFonts w:ascii="Calibri" w:hAnsi="Calibri"/>
+                <w:color w:val="000000"/>
+                <w:sz w:val="20"/>
+                <w:lang w:val="es-ES"/>
+              </w:rPr>
+              <w:t>Controles PII implementados + aviso de privacidad redactado</w:t>
+            </w:r>
+          </w:p>
+        </w:tc>
+        <w:tc>
+          <w:tcPr>
+            <w:tcW w:w="1000" w:type="dxa"/>
+          </w:tcPr>
+          <w:p>
+            <w:pPr>
+              <w:spacing w:before="40" w:after="40"/>
+              <w:rPr>
+                <w:lang w:val="es-ES"/>
+              </w:rPr>
+            </w:pPr>
+            <w:r>
+              <w:rPr>
+                <w:rFonts w:ascii="Calibri" w:hAnsi="Calibri"/>
+                <w:color w:val="000000"/>
+                <w:sz w:val="20"/>
+                <w:lang w:val="es-ES"/>
+              </w:rPr>
+              <w:t>BAJO</w:t>
+            </w:r>
+          </w:p>
+        </w:tc>
+        <w:tc>
+          <w:tcPr>
+            <w:tcW w:w="3860" w:type="dxa"/>
+          </w:tcPr>
+          <w:p>
+            <w:pPr>
+              <w:spacing w:before="40" w:after="40"/>
+              <w:rPr>
+                <w:lang w:val="es-ES"/>
+              </w:rPr>
+            </w:pPr>
+            <w:r>
+              <w:rPr>
+                <w:rFonts w:ascii="Calibri" w:hAnsi="Calibri"/>
+                <w:color w:val="000000"/>
+                <w:sz w:val="20"/>
+                <w:lang w:val="es-ES"/>
+              </w:rPr>
+              <w:t>Revisión legal anual o ante cambio normativo relevante</w:t>
             </w:r>
           </w:p>
         </w:tc>
@@ -3838,21 +3932,45 @@
     </w:tbl>
     <w:p>
       <w:pPr>
-        <w:spacing w:before="80"/>
-        <w:jc w:val="center"/>
-        <w:rPr>
-          <w:lang w:val="es-ES"/>
-        </w:rPr>
+        <w:spacing w:after="80"/>
       </w:pPr>
-      <w:r>
-        <w:rPr>
-          <w:rFonts w:ascii="Calibri" w:hAnsi="Calibri"/>
-          <w:i/>
-          <w:color w:val="556580"/>
-          <w:sz w:val="18"/>
-          <w:lang w:val="es-ES"/>
-        </w:rPr>
-        <w:t>Tabla 3. Acciones para el modelo y pipeline ML.</w:t>
+    </w:p>
+    <w:p>
+      <w:pPr>
+        <w:pBdr>
+          <w:bottom w:val="single" w:sz="6" w:space="1" w:color="003987"/>
+        </w:pBdr>
+        <w:spacing w:before="360" w:after="80"/>
+        <w:rPr>
+          <w:lang w:val="es-ES"/>
+        </w:rPr>
+      </w:pPr>
+      <w:r>
+        <w:rPr>
+          <w:rFonts w:ascii="Calibri" w:hAnsi="Calibri"/>
+          <w:b/>
+          <w:color w:val="003987"/>
+          <w:sz w:val="28"/>
+          <w:lang w:val="es-ES"/>
+        </w:rPr>
+        <w:t>3. Objetivo 4.2 — Medidas y Decisiones Específicas</w:t>
+      </w:r>
+    </w:p>
+    <w:p>
+      <w:pPr>
+        <w:spacing w:after="160"/>
+        <w:jc w:val="both"/>
+        <w:rPr>
+          <w:lang w:val="es-ES"/>
+        </w:rPr>
+      </w:pPr>
+      <w:r>
+        <w:rPr>
+          <w:rFonts w:ascii="Calibri" w:hAnsi="Calibri"/>
+          <w:color w:val="000000"/>
+          <w:lang w:val="es-ES"/>
+        </w:rPr>
+        <w:t>A partir de los hallazgos obtenidos durante el modelado (E3–E5), se identifican las medidas concretas que deben tomarse para garantizar el éxito del proyecto en producción.</w:t>
       </w:r>
     </w:p>
     <w:p>
@@ -3870,7 +3988,7 @@
           <w:sz w:val="24"/>
           <w:lang w:val="es-ES"/>
         </w:rPr>
-        <w:t>3.2 Datos</w:t>
+        <w:t>3.1 Modelo y ML</w:t>
       </w:r>
     </w:p>
     <w:tbl>
@@ -3881,10 +3999,11 @@
         <w:tblLook w:val="04A0" w:firstRow="1" w:lastRow="0" w:firstColumn="1" w:lastColumn="0" w:noHBand="0" w:noVBand="1"/>
       </w:tblPr>
       <w:tblGrid>
-        <w:gridCol w:w="4252"/>
-        <w:gridCol w:w="1247"/>
-        <w:gridCol w:w="1701"/>
-        <w:gridCol w:w="1417"/>
+        <w:gridCol w:w="3826"/>
+        <w:gridCol w:w="1197"/>
+        <w:gridCol w:w="1618"/>
+        <w:gridCol w:w="1347"/>
+        <w:gridCol w:w="1362"/>
       </w:tblGrid>
       <w:tr>
         <w:trPr>
@@ -3994,6 +4113,32 @@
             </w:r>
           </w:p>
         </w:tc>
+        <w:tc>
+          <w:tcPr>
+            <w:tcW w:w="1417" w:type="dxa"/>
+            <w:shd w:val="clear" w:color="auto" w:fill="003987"/>
+            <w:vAlign w:val="center"/>
+          </w:tcPr>
+          <w:p>
+            <w:pPr>
+              <w:spacing w:before="60" w:after="60"/>
+              <w:jc w:val="center"/>
+              <w:rPr>
+                <w:lang w:val="es-ES"/>
+              </w:rPr>
+            </w:pPr>
+            <w:r>
+              <w:rPr>
+                <w:rFonts w:ascii="Calibri" w:hAnsi="Calibri"/>
+                <w:b/>
+                <w:color w:val="FFFFFF"/>
+                <w:sz w:val="20"/>
+                <w:lang w:val="es-ES"/>
+              </w:rPr>
+              <w:t>Métrica de éxito</w:t>
+            </w:r>
+          </w:p>
+        </w:tc>
       </w:tr>
       <w:tr>
         <w:trPr>
@@ -4019,7 +4164,7 @@
                 <w:sz w:val="20"/>
                 <w:lang w:val="es-ES"/>
               </w:rPr>
-              <w:t>Ampliar muestra Jersey y Pardo Suizo a 200+ vacas/raza (sub-representadas)</w:t>
+              <w:t>Desplegar Stacking-E5 (pipeline_final_e5.pkl) como modelo de producción</w:t>
             </w:r>
           </w:p>
         </w:tc>
@@ -4041,11 +4186,11 @@
               <w:rPr>
                 <w:rFonts w:ascii="Calibri" w:hAnsi="Calibri"/>
                 <w:b/>
-                <w:color w:val="E68A00"/>
-                <w:sz w:val="20"/>
-                <w:lang w:val="es-ES"/>
-              </w:rPr>
-              <w:t>Media</w:t>
+                <w:color w:val="CC3333"/>
+                <w:sz w:val="20"/>
+                <w:lang w:val="es-ES"/>
+              </w:rPr>
+              <w:t>Alta</w:t>
             </w:r>
           </w:p>
         </w:tc>
@@ -4069,7 +4214,7 @@
                 <w:sz w:val="20"/>
                 <w:lang w:val="es-ES"/>
               </w:rPr>
-              <w:t>Ganadero/Campo</w:t>
+              <w:t>Equipo ML</w:t>
             </w:r>
           </w:p>
         </w:tc>
@@ -4094,7 +4239,32 @@
                 <w:sz w:val="20"/>
                 <w:lang w:val="es-ES"/>
               </w:rPr>
-              <w:t>6 meses</w:t>
+              <w:t>Inmediato</w:t>
+            </w:r>
+          </w:p>
+        </w:tc>
+        <w:tc>
+          <w:tcPr>
+            <w:tcW w:w="1417" w:type="dxa"/>
+            <w:shd w:val="clear" w:color="auto" w:fill="FFFFFF"/>
+            <w:vAlign w:val="center"/>
+          </w:tcPr>
+          <w:p>
+            <w:pPr>
+              <w:spacing w:before="40" w:after="40"/>
+              <w:jc w:val="center"/>
+              <w:rPr>
+                <w:lang w:val="es-ES"/>
+              </w:rPr>
+            </w:pPr>
+            <w:r>
+              <w:rPr>
+                <w:rFonts w:ascii="Calibri" w:hAnsi="Calibri"/>
+                <w:color w:val="000000"/>
+                <w:sz w:val="20"/>
+                <w:lang w:val="es-ES"/>
+              </w:rPr>
+              <w:t>RMSE producción ≤ 0.75; latencia P95 &lt; 200 ms sostenidos 30 días</w:t>
             </w:r>
           </w:p>
         </w:tc>
@@ -4123,27 +4293,7 @@
                 <w:sz w:val="20"/>
                 <w:lang w:val="es-ES"/>
               </w:rPr>
-              <w:t xml:space="preserve">Integrar medición real de laboratorio en </w:t>
-            </w:r>
-            <w:proofErr w:type="gramStart"/>
-            <w:r>
-              <w:rPr>
-                <w:rFonts w:ascii="Calibri" w:hAnsi="Calibri"/>
-                <w:color w:val="000000"/>
-                <w:sz w:val="20"/>
-                <w:lang w:val="es-ES"/>
-              </w:rPr>
-              <w:t>app</w:t>
-            </w:r>
-            <w:proofErr w:type="gramEnd"/>
-            <w:r>
-              <w:rPr>
-                <w:rFonts w:ascii="Calibri" w:hAnsi="Calibri"/>
-                <w:color w:val="000000"/>
-                <w:sz w:val="20"/>
-                <w:lang w:val="es-ES"/>
-              </w:rPr>
-              <w:t xml:space="preserve"> para retroalimentación continua</w:t>
+              <w:t>Implementar reentrenamiento trimestral con datos recientes (Q1–Q4)</w:t>
             </w:r>
           </w:p>
         </w:tc>
@@ -4193,7 +4343,7 @@
                 <w:sz w:val="20"/>
                 <w:lang w:val="es-ES"/>
               </w:rPr>
-              <w:t>Dev + Campo</w:t>
+              <w:t>Equipo ML</w:t>
             </w:r>
           </w:p>
         </w:tc>
@@ -4218,7 +4368,181 @@
                 <w:sz w:val="20"/>
                 <w:lang w:val="es-ES"/>
               </w:rPr>
-              <w:t>Inmediato</w:t>
+              <w:t>Trimestral</w:t>
+            </w:r>
+          </w:p>
+        </w:tc>
+        <w:tc>
+          <w:tcPr>
+            <w:tcW w:w="1417" w:type="dxa"/>
+            <w:shd w:val="clear" w:color="auto" w:fill="F4F6FA"/>
+            <w:vAlign w:val="center"/>
+          </w:tcPr>
+          <w:p>
+            <w:pPr>
+              <w:spacing w:before="40" w:after="40"/>
+              <w:jc w:val="center"/>
+              <w:rPr>
+                <w:lang w:val="es-ES"/>
+              </w:rPr>
+            </w:pPr>
+            <w:r>
+              <w:rPr>
+                <w:rFonts w:ascii="Calibri" w:hAnsi="Calibri"/>
+                <w:color w:val="000000"/>
+                <w:sz w:val="20"/>
+                <w:lang w:val="es-ES"/>
+              </w:rPr>
+              <w:t>RMSE post-retrain no supera baseline +10%; drift KS p &gt; 0.05</w:t>
+            </w:r>
+          </w:p>
+        </w:tc>
+      </w:tr>
+      <w:tr>
+        <w:trPr>
+          <w:jc w:val="center"/>
+        </w:trPr>
+        <w:tc>
+          <w:tcPr>
+            <w:tcW w:w="4252" w:type="dxa"/>
+            <w:shd w:val="clear" w:color="auto" w:fill="FFFFFF"/>
+            <w:vAlign w:val="center"/>
+          </w:tcPr>
+          <w:p>
+            <w:pPr>
+              <w:spacing w:before="40" w:after="40"/>
+              <w:rPr>
+                <w:lang w:val="es-ES"/>
+              </w:rPr>
+            </w:pPr>
+            <w:r>
+              <w:rPr>
+                <w:rFonts w:ascii="Calibri" w:hAnsi="Calibri"/>
+                <w:color w:val="000000"/>
+                <w:sz w:val="20"/>
+                <w:lang w:val="es-ES"/>
+              </w:rPr>
+              <w:t xml:space="preserve">Monitoreo KS mensual — </w:t>
+            </w:r>
+            <w:proofErr w:type="spellStart"/>
+            <w:r>
+              <w:rPr>
+                <w:rFonts w:ascii="Calibri" w:hAnsi="Calibri"/>
+                <w:color w:val="000000"/>
+                <w:sz w:val="20"/>
+                <w:lang w:val="es-ES"/>
+              </w:rPr>
+              <w:t>trigger</w:t>
+            </w:r>
+            <w:proofErr w:type="spellEnd"/>
+            <w:r>
+              <w:rPr>
+                <w:rFonts w:ascii="Calibri" w:hAnsi="Calibri"/>
+                <w:color w:val="000000"/>
+                <w:sz w:val="20"/>
+                <w:lang w:val="es-ES"/>
+              </w:rPr>
+              <w:t xml:space="preserve"> automático si p &lt; 0.05</w:t>
+            </w:r>
+          </w:p>
+        </w:tc>
+        <w:tc>
+          <w:tcPr>
+            <w:tcW w:w="1247" w:type="dxa"/>
+            <w:shd w:val="clear" w:color="auto" w:fill="FFFFFF"/>
+            <w:vAlign w:val="center"/>
+          </w:tcPr>
+          <w:p>
+            <w:pPr>
+              <w:spacing w:before="40" w:after="40"/>
+              <w:jc w:val="center"/>
+              <w:rPr>
+                <w:lang w:val="es-ES"/>
+              </w:rPr>
+            </w:pPr>
+            <w:r>
+              <w:rPr>
+                <w:rFonts w:ascii="Calibri" w:hAnsi="Calibri"/>
+                <w:b/>
+                <w:color w:val="CC3333"/>
+                <w:sz w:val="20"/>
+                <w:lang w:val="es-ES"/>
+              </w:rPr>
+              <w:t>Alta</w:t>
+            </w:r>
+          </w:p>
+        </w:tc>
+        <w:tc>
+          <w:tcPr>
+            <w:tcW w:w="1701" w:type="dxa"/>
+            <w:shd w:val="clear" w:color="auto" w:fill="FFFFFF"/>
+            <w:vAlign w:val="center"/>
+          </w:tcPr>
+          <w:p>
+            <w:pPr>
+              <w:spacing w:before="40" w:after="40"/>
+              <w:rPr>
+                <w:lang w:val="es-ES"/>
+              </w:rPr>
+            </w:pPr>
+            <w:r>
+              <w:rPr>
+                <w:rFonts w:ascii="Calibri" w:hAnsi="Calibri"/>
+                <w:color w:val="000000"/>
+                <w:sz w:val="20"/>
+                <w:lang w:val="es-ES"/>
+              </w:rPr>
+              <w:t>Equipo ML</w:t>
+            </w:r>
+          </w:p>
+        </w:tc>
+        <w:tc>
+          <w:tcPr>
+            <w:tcW w:w="1417" w:type="dxa"/>
+            <w:shd w:val="clear" w:color="auto" w:fill="FFFFFF"/>
+            <w:vAlign w:val="center"/>
+          </w:tcPr>
+          <w:p>
+            <w:pPr>
+              <w:spacing w:before="40" w:after="40"/>
+              <w:jc w:val="center"/>
+              <w:rPr>
+                <w:lang w:val="es-ES"/>
+              </w:rPr>
+            </w:pPr>
+            <w:r>
+              <w:rPr>
+                <w:rFonts w:ascii="Calibri" w:hAnsi="Calibri"/>
+                <w:color w:val="000000"/>
+                <w:sz w:val="20"/>
+                <w:lang w:val="es-ES"/>
+              </w:rPr>
+              <w:t>Mensual</w:t>
+            </w:r>
+          </w:p>
+        </w:tc>
+        <w:tc>
+          <w:tcPr>
+            <w:tcW w:w="1417" w:type="dxa"/>
+            <w:shd w:val="clear" w:color="auto" w:fill="FFFFFF"/>
+            <w:vAlign w:val="center"/>
+          </w:tcPr>
+          <w:p>
+            <w:pPr>
+              <w:spacing w:before="40" w:after="40"/>
+              <w:jc w:val="center"/>
+              <w:rPr>
+                <w:lang w:val="es-ES"/>
+              </w:rPr>
+            </w:pPr>
+            <w:r>
+              <w:rPr>
+                <w:rFonts w:ascii="Calibri" w:hAnsi="Calibri"/>
+                <w:color w:val="000000"/>
+                <w:sz w:val="20"/>
+                <w:lang w:val="es-ES"/>
+              </w:rPr>
+              <w:t>0 alertas de drift sin respuesta &gt; 72 h en 6 meses</w:t>
             </w:r>
           </w:p>
         </w:tc>
@@ -4240,7 +4564,7 @@
           <w:sz w:val="18"/>
           <w:lang w:val="es-ES"/>
         </w:rPr>
-        <w:t>Tabla 4. Acciones sobre los datos.</w:t>
+        <w:t>Tabla 3. Acciones para el modelo y pipeline ML.</w:t>
       </w:r>
     </w:p>
     <w:p>
@@ -4258,7 +4582,7 @@
           <w:sz w:val="24"/>
           <w:lang w:val="es-ES"/>
         </w:rPr>
-        <w:t>3.3 Operaciones</w:t>
+        <w:t>3.2 Datos</w:t>
       </w:r>
     </w:p>
     <w:tbl>
@@ -4269,10 +4593,11 @@
         <w:tblLook w:val="04A0" w:firstRow="1" w:lastRow="0" w:firstColumn="1" w:lastColumn="0" w:noHBand="0" w:noVBand="1"/>
       </w:tblPr>
       <w:tblGrid>
-        <w:gridCol w:w="4252"/>
-        <w:gridCol w:w="1247"/>
-        <w:gridCol w:w="1701"/>
-        <w:gridCol w:w="1417"/>
+        <w:gridCol w:w="3721"/>
+        <w:gridCol w:w="1193"/>
+        <w:gridCol w:w="1694"/>
+        <w:gridCol w:w="1341"/>
+        <w:gridCol w:w="1401"/>
       </w:tblGrid>
       <w:tr>
         <w:trPr>
@@ -4382,6 +4707,32 @@
             </w:r>
           </w:p>
         </w:tc>
+        <w:tc>
+          <w:tcPr>
+            <w:tcW w:w="1417" w:type="dxa"/>
+            <w:shd w:val="clear" w:color="auto" w:fill="003987"/>
+            <w:vAlign w:val="center"/>
+          </w:tcPr>
+          <w:p>
+            <w:pPr>
+              <w:spacing w:before="60" w:after="60"/>
+              <w:jc w:val="center"/>
+              <w:rPr>
+                <w:lang w:val="es-ES"/>
+              </w:rPr>
+            </w:pPr>
+            <w:r>
+              <w:rPr>
+                <w:rFonts w:ascii="Calibri" w:hAnsi="Calibri"/>
+                <w:b/>
+                <w:color w:val="FFFFFF"/>
+                <w:sz w:val="20"/>
+                <w:lang w:val="es-ES"/>
+              </w:rPr>
+              <w:t>Métrica de éxito</w:t>
+            </w:r>
+          </w:p>
+        </w:tc>
       </w:tr>
       <w:tr>
         <w:trPr>
@@ -4400,25 +4751,14 @@
                 <w:lang w:val="es-ES"/>
               </w:rPr>
             </w:pPr>
-            <w:proofErr w:type="spellStart"/>
-            <w:r>
-              <w:rPr>
-                <w:rFonts w:ascii="Calibri" w:hAnsi="Calibri"/>
-                <w:color w:val="000000"/>
-                <w:sz w:val="20"/>
-                <w:lang w:val="es-ES"/>
-              </w:rPr>
-              <w:t>Contenerizar</w:t>
-            </w:r>
-            <w:proofErr w:type="spellEnd"/>
-            <w:r>
-              <w:rPr>
-                <w:rFonts w:ascii="Calibri" w:hAnsi="Calibri"/>
-                <w:color w:val="000000"/>
-                <w:sz w:val="20"/>
-                <w:lang w:val="es-ES"/>
-              </w:rPr>
-              <w:t xml:space="preserve"> en Docker para portabilidad en cualquier servidor/nube</w:t>
+            <w:r>
+              <w:rPr>
+                <w:rFonts w:ascii="Calibri" w:hAnsi="Calibri"/>
+                <w:color w:val="000000"/>
+                <w:sz w:val="20"/>
+                <w:lang w:val="es-ES"/>
+              </w:rPr>
+              <w:t>Ampliar muestra Jersey y Pardo Suizo a 200+ vacas/raza (sub-representadas)</w:t>
             </w:r>
           </w:p>
         </w:tc>
@@ -4440,11 +4780,11 @@
               <w:rPr>
                 <w:rFonts w:ascii="Calibri" w:hAnsi="Calibri"/>
                 <w:b/>
-                <w:color w:val="CC3333"/>
-                <w:sz w:val="20"/>
-                <w:lang w:val="es-ES"/>
-              </w:rPr>
-              <w:t>Alta</w:t>
+                <w:color w:val="E68A00"/>
+                <w:sz w:val="20"/>
+                <w:lang w:val="es-ES"/>
+              </w:rPr>
+              <w:t>Media</w:t>
             </w:r>
           </w:p>
         </w:tc>
@@ -4468,19 +4808,8 @@
                 <w:sz w:val="20"/>
                 <w:lang w:val="es-ES"/>
               </w:rPr>
-              <w:t>Dev/</w:t>
-            </w:r>
-            <w:proofErr w:type="spellStart"/>
-            <w:r>
-              <w:rPr>
-                <w:rFonts w:ascii="Calibri" w:hAnsi="Calibri"/>
-                <w:color w:val="000000"/>
-                <w:sz w:val="20"/>
-                <w:lang w:val="es-ES"/>
-              </w:rPr>
-              <w:t>Ops</w:t>
-            </w:r>
-            <w:proofErr w:type="spellEnd"/>
+              <w:t>Ganadero/Campo</w:t>
+            </w:r>
           </w:p>
         </w:tc>
         <w:tc>
@@ -4504,7 +4833,32 @@
                 <w:sz w:val="20"/>
                 <w:lang w:val="es-ES"/>
               </w:rPr>
-              <w:t>Sprint 1</w:t>
+              <w:t>6 meses</w:t>
+            </w:r>
+          </w:p>
+        </w:tc>
+        <w:tc>
+          <w:tcPr>
+            <w:tcW w:w="1417" w:type="dxa"/>
+            <w:shd w:val="clear" w:color="auto" w:fill="FFFFFF"/>
+            <w:vAlign w:val="center"/>
+          </w:tcPr>
+          <w:p>
+            <w:pPr>
+              <w:spacing w:before="40" w:after="40"/>
+              <w:jc w:val="center"/>
+              <w:rPr>
+                <w:lang w:val="es-ES"/>
+              </w:rPr>
+            </w:pPr>
+            <w:r>
+              <w:rPr>
+                <w:rFonts w:ascii="Calibri" w:hAnsi="Calibri"/>
+                <w:color w:val="000000"/>
+                <w:sz w:val="20"/>
+                <w:lang w:val="es-ES"/>
+              </w:rPr>
+              <w:t>≥ 200 registros/raza adicional; error por raza &lt; 10% vs. total</w:t>
             </w:r>
           </w:p>
         </w:tc>
@@ -4533,87 +4887,27 @@
                 <w:sz w:val="20"/>
                 <w:lang w:val="es-ES"/>
               </w:rPr>
-              <w:t xml:space="preserve">CI/CD GitHub </w:t>
-            </w:r>
-            <w:proofErr w:type="spellStart"/>
-            <w:r>
-              <w:rPr>
-                <w:rFonts w:ascii="Calibri" w:hAnsi="Calibri"/>
-                <w:color w:val="000000"/>
-                <w:sz w:val="20"/>
-                <w:lang w:val="es-ES"/>
-              </w:rPr>
-              <w:t>Actions</w:t>
-            </w:r>
-            <w:proofErr w:type="spellEnd"/>
-            <w:r>
-              <w:rPr>
-                <w:rFonts w:ascii="Calibri" w:hAnsi="Calibri"/>
-                <w:color w:val="000000"/>
-                <w:sz w:val="20"/>
-                <w:lang w:val="es-ES"/>
-              </w:rPr>
-              <w:t xml:space="preserve">: </w:t>
-            </w:r>
-            <w:proofErr w:type="spellStart"/>
-            <w:r>
-              <w:rPr>
-                <w:rFonts w:ascii="Calibri" w:hAnsi="Calibri"/>
-                <w:color w:val="000000"/>
-                <w:sz w:val="20"/>
-                <w:lang w:val="es-ES"/>
-              </w:rPr>
-              <w:t>push</w:t>
-            </w:r>
-            <w:proofErr w:type="spellEnd"/>
-            <w:r>
-              <w:rPr>
-                <w:rFonts w:ascii="Calibri" w:hAnsi="Calibri"/>
-                <w:color w:val="000000"/>
-                <w:sz w:val="20"/>
-                <w:lang w:val="es-ES"/>
-              </w:rPr>
-              <w:t xml:space="preserve"> → </w:t>
-            </w:r>
-            <w:proofErr w:type="spellStart"/>
-            <w:r>
-              <w:rPr>
-                <w:rFonts w:ascii="Calibri" w:hAnsi="Calibri"/>
-                <w:color w:val="000000"/>
-                <w:sz w:val="20"/>
-                <w:lang w:val="es-ES"/>
-              </w:rPr>
-              <w:t>build</w:t>
-            </w:r>
-            <w:proofErr w:type="spellEnd"/>
-            <w:r>
-              <w:rPr>
-                <w:rFonts w:ascii="Calibri" w:hAnsi="Calibri"/>
-                <w:color w:val="000000"/>
-                <w:sz w:val="20"/>
-                <w:lang w:val="es-ES"/>
-              </w:rPr>
-              <w:t xml:space="preserve"> → test → </w:t>
-            </w:r>
-            <w:proofErr w:type="spellStart"/>
-            <w:r>
-              <w:rPr>
-                <w:rFonts w:ascii="Calibri" w:hAnsi="Calibri"/>
-                <w:color w:val="000000"/>
-                <w:sz w:val="20"/>
-                <w:lang w:val="es-ES"/>
-              </w:rPr>
-              <w:t>deploy</w:t>
-            </w:r>
-            <w:proofErr w:type="spellEnd"/>
-            <w:r>
-              <w:rPr>
-                <w:rFonts w:ascii="Calibri" w:hAnsi="Calibri"/>
-                <w:color w:val="000000"/>
-                <w:sz w:val="20"/>
-                <w:lang w:val="es-ES"/>
-              </w:rPr>
-              <w:t xml:space="preserve"> automático</w:t>
+              <w:t xml:space="preserve">Integrar medición real de laboratorio en </w:t>
+            </w:r>
+            <w:proofErr w:type="gramStart"/>
+            <w:r>
+              <w:rPr>
+                <w:rFonts w:ascii="Calibri" w:hAnsi="Calibri"/>
+                <w:color w:val="000000"/>
+                <w:sz w:val="20"/>
+                <w:lang w:val="es-ES"/>
+              </w:rPr>
+              <w:t>app</w:t>
+            </w:r>
+            <w:proofErr w:type="gramEnd"/>
+            <w:r>
+              <w:rPr>
+                <w:rFonts w:ascii="Calibri" w:hAnsi="Calibri"/>
+                <w:color w:val="000000"/>
+                <w:sz w:val="20"/>
+                <w:lang w:val="es-ES"/>
+              </w:rPr>
+              <w:t xml:space="preserve"> para retroalimentación continua</w:t>
             </w:r>
           </w:p>
         </w:tc>
@@ -4635,11 +4929,11 @@
               <w:rPr>
                 <w:rFonts w:ascii="Calibri" w:hAnsi="Calibri"/>
                 <w:b/>
-                <w:color w:val="E68A00"/>
-                <w:sz w:val="20"/>
-                <w:lang w:val="es-ES"/>
-              </w:rPr>
-              <w:t>Media</w:t>
+                <w:color w:val="CC3333"/>
+                <w:sz w:val="20"/>
+                <w:lang w:val="es-ES"/>
+              </w:rPr>
+              <w:t>Alta</w:t>
             </w:r>
           </w:p>
         </w:tc>
@@ -4663,19 +4957,8 @@
                 <w:sz w:val="20"/>
                 <w:lang w:val="es-ES"/>
               </w:rPr>
-              <w:t>Dev/</w:t>
-            </w:r>
-            <w:proofErr w:type="spellStart"/>
-            <w:r>
-              <w:rPr>
-                <w:rFonts w:ascii="Calibri" w:hAnsi="Calibri"/>
-                <w:color w:val="000000"/>
-                <w:sz w:val="20"/>
-                <w:lang w:val="es-ES"/>
-              </w:rPr>
-              <w:t>Ops</w:t>
-            </w:r>
-            <w:proofErr w:type="spellEnd"/>
+              <w:t>Dev + Campo</w:t>
+            </w:r>
           </w:p>
         </w:tc>
         <w:tc>
@@ -4699,7 +4982,591 @@
                 <w:sz w:val="20"/>
                 <w:lang w:val="es-ES"/>
               </w:rPr>
+              <w:t>Inmediato</w:t>
+            </w:r>
+          </w:p>
+        </w:tc>
+        <w:tc>
+          <w:tcPr>
+            <w:tcW w:w="1417" w:type="dxa"/>
+            <w:shd w:val="clear" w:color="auto" w:fill="F4F6FA"/>
+            <w:vAlign w:val="center"/>
+          </w:tcPr>
+          <w:p>
+            <w:pPr>
+              <w:spacing w:before="40" w:after="40"/>
+              <w:jc w:val="center"/>
+              <w:rPr>
+                <w:lang w:val="es-ES"/>
+              </w:rPr>
+            </w:pPr>
+            <w:r>
+              <w:rPr>
+                <w:rFonts w:ascii="Calibri" w:hAnsi="Calibri"/>
+                <w:color w:val="000000"/>
+                <w:sz w:val="20"/>
+                <w:lang w:val="es-ES"/>
+              </w:rPr>
+              <w:t>≥ 90% de predicciones validadas con laboratorio en 4 semanas</w:t>
+            </w:r>
+          </w:p>
+        </w:tc>
+      </w:tr>
+    </w:tbl>
+    <w:p>
+      <w:pPr>
+        <w:spacing w:before="80"/>
+        <w:jc w:val="center"/>
+        <w:rPr>
+          <w:lang w:val="es-ES"/>
+        </w:rPr>
+      </w:pPr>
+      <w:r>
+        <w:rPr>
+          <w:rFonts w:ascii="Calibri" w:hAnsi="Calibri"/>
+          <w:i/>
+          <w:color w:val="556580"/>
+          <w:sz w:val="18"/>
+          <w:lang w:val="es-ES"/>
+        </w:rPr>
+        <w:lastRenderedPageBreak/>
+        <w:t>Tabla 4. Acciones sobre los datos.</w:t>
+      </w:r>
+    </w:p>
+    <w:p>
+      <w:pPr>
+        <w:spacing w:before="240" w:after="60"/>
+        <w:rPr>
+          <w:lang w:val="es-ES"/>
+        </w:rPr>
+      </w:pPr>
+      <w:r>
+        <w:rPr>
+          <w:rFonts w:ascii="Calibri" w:hAnsi="Calibri"/>
+          <w:b/>
+          <w:color w:val="003987"/>
+          <w:sz w:val="24"/>
+          <w:lang w:val="es-ES"/>
+        </w:rPr>
+        <w:t>3.3 Operaciones</w:t>
+      </w:r>
+    </w:p>
+    <w:tbl>
+      <w:tblPr>
+        <w:tblStyle w:val="Tablaconcuadrcula"/>
+        <w:tblW w:w="0" w:type="auto"/>
+        <w:jc w:val="center"/>
+        <w:tblLook w:val="04A0" w:firstRow="1" w:lastRow="0" w:firstColumn="1" w:lastColumn="0" w:noHBand="0" w:noVBand="1"/>
+      </w:tblPr>
+      <w:tblGrid>
+        <w:gridCol w:w="3804"/>
+        <w:gridCol w:w="1206"/>
+        <w:gridCol w:w="1633"/>
+        <w:gridCol w:w="1305"/>
+        <w:gridCol w:w="1402"/>
+      </w:tblGrid>
+      <w:tr>
+        <w:trPr>
+          <w:jc w:val="center"/>
+        </w:trPr>
+        <w:tc>
+          <w:tcPr>
+            <w:tcW w:w="4252" w:type="dxa"/>
+            <w:shd w:val="clear" w:color="auto" w:fill="003987"/>
+            <w:vAlign w:val="center"/>
+          </w:tcPr>
+          <w:p>
+            <w:pPr>
+              <w:spacing w:before="60" w:after="60"/>
+              <w:jc w:val="center"/>
+              <w:rPr>
+                <w:lang w:val="es-ES"/>
+              </w:rPr>
+            </w:pPr>
+            <w:r>
+              <w:rPr>
+                <w:rFonts w:ascii="Calibri" w:hAnsi="Calibri"/>
+                <w:b/>
+                <w:color w:val="FFFFFF"/>
+                <w:sz w:val="20"/>
+                <w:lang w:val="es-ES"/>
+              </w:rPr>
+              <w:t>Acción</w:t>
+            </w:r>
+          </w:p>
+        </w:tc>
+        <w:tc>
+          <w:tcPr>
+            <w:tcW w:w="1247" w:type="dxa"/>
+            <w:shd w:val="clear" w:color="auto" w:fill="003987"/>
+            <w:vAlign w:val="center"/>
+          </w:tcPr>
+          <w:p>
+            <w:pPr>
+              <w:spacing w:before="60" w:after="60"/>
+              <w:jc w:val="center"/>
+              <w:rPr>
+                <w:lang w:val="es-ES"/>
+              </w:rPr>
+            </w:pPr>
+            <w:r>
+              <w:rPr>
+                <w:rFonts w:ascii="Calibri" w:hAnsi="Calibri"/>
+                <w:b/>
+                <w:color w:val="FFFFFF"/>
+                <w:sz w:val="20"/>
+                <w:lang w:val="es-ES"/>
+              </w:rPr>
+              <w:t>Prioridad</w:t>
+            </w:r>
+          </w:p>
+        </w:tc>
+        <w:tc>
+          <w:tcPr>
+            <w:tcW w:w="1701" w:type="dxa"/>
+            <w:shd w:val="clear" w:color="auto" w:fill="003987"/>
+            <w:vAlign w:val="center"/>
+          </w:tcPr>
+          <w:p>
+            <w:pPr>
+              <w:spacing w:before="60" w:after="60"/>
+              <w:jc w:val="center"/>
+              <w:rPr>
+                <w:lang w:val="es-ES"/>
+              </w:rPr>
+            </w:pPr>
+            <w:r>
+              <w:rPr>
+                <w:rFonts w:ascii="Calibri" w:hAnsi="Calibri"/>
+                <w:b/>
+                <w:color w:val="FFFFFF"/>
+                <w:sz w:val="20"/>
+                <w:lang w:val="es-ES"/>
+              </w:rPr>
+              <w:t>Responsable</w:t>
+            </w:r>
+          </w:p>
+        </w:tc>
+        <w:tc>
+          <w:tcPr>
+            <w:tcW w:w="1417" w:type="dxa"/>
+            <w:shd w:val="clear" w:color="auto" w:fill="003987"/>
+            <w:vAlign w:val="center"/>
+          </w:tcPr>
+          <w:p>
+            <w:pPr>
+              <w:spacing w:before="60" w:after="60"/>
+              <w:jc w:val="center"/>
+              <w:rPr>
+                <w:lang w:val="es-ES"/>
+              </w:rPr>
+            </w:pPr>
+            <w:r>
+              <w:rPr>
+                <w:rFonts w:ascii="Calibri" w:hAnsi="Calibri"/>
+                <w:b/>
+                <w:color w:val="FFFFFF"/>
+                <w:sz w:val="20"/>
+                <w:lang w:val="es-ES"/>
+              </w:rPr>
+              <w:t>Plazo</w:t>
+            </w:r>
+          </w:p>
+        </w:tc>
+        <w:tc>
+          <w:tcPr>
+            <w:tcW w:w="1417" w:type="dxa"/>
+            <w:shd w:val="clear" w:color="auto" w:fill="003987"/>
+            <w:vAlign w:val="center"/>
+          </w:tcPr>
+          <w:p>
+            <w:pPr>
+              <w:spacing w:before="60" w:after="60"/>
+              <w:jc w:val="center"/>
+              <w:rPr>
+                <w:lang w:val="es-ES"/>
+              </w:rPr>
+            </w:pPr>
+            <w:r>
+              <w:rPr>
+                <w:rFonts w:ascii="Calibri" w:hAnsi="Calibri"/>
+                <w:b/>
+                <w:color w:val="FFFFFF"/>
+                <w:sz w:val="20"/>
+                <w:lang w:val="es-ES"/>
+              </w:rPr>
+              <w:t>Métrica de éxito</w:t>
+            </w:r>
+          </w:p>
+        </w:tc>
+      </w:tr>
+      <w:tr>
+        <w:trPr>
+          <w:jc w:val="center"/>
+        </w:trPr>
+        <w:tc>
+          <w:tcPr>
+            <w:tcW w:w="4252" w:type="dxa"/>
+            <w:shd w:val="clear" w:color="auto" w:fill="FFFFFF"/>
+            <w:vAlign w:val="center"/>
+          </w:tcPr>
+          <w:p>
+            <w:pPr>
+              <w:spacing w:before="40" w:after="40"/>
+              <w:rPr>
+                <w:lang w:val="es-ES"/>
+              </w:rPr>
+            </w:pPr>
+            <w:proofErr w:type="spellStart"/>
+            <w:r>
+              <w:rPr>
+                <w:rFonts w:ascii="Calibri" w:hAnsi="Calibri"/>
+                <w:color w:val="000000"/>
+                <w:sz w:val="20"/>
+                <w:lang w:val="es-ES"/>
+              </w:rPr>
+              <w:t>Contenerizar</w:t>
+            </w:r>
+            <w:proofErr w:type="spellEnd"/>
+            <w:r>
+              <w:rPr>
+                <w:rFonts w:ascii="Calibri" w:hAnsi="Calibri"/>
+                <w:color w:val="000000"/>
+                <w:sz w:val="20"/>
+                <w:lang w:val="es-ES"/>
+              </w:rPr>
+              <w:t xml:space="preserve"> en Docker para portabilidad en cualquier servidor/nube</w:t>
+            </w:r>
+          </w:p>
+        </w:tc>
+        <w:tc>
+          <w:tcPr>
+            <w:tcW w:w="1247" w:type="dxa"/>
+            <w:shd w:val="clear" w:color="auto" w:fill="FFFFFF"/>
+            <w:vAlign w:val="center"/>
+          </w:tcPr>
+          <w:p>
+            <w:pPr>
+              <w:spacing w:before="40" w:after="40"/>
+              <w:jc w:val="center"/>
+              <w:rPr>
+                <w:lang w:val="es-ES"/>
+              </w:rPr>
+            </w:pPr>
+            <w:r>
+              <w:rPr>
+                <w:rFonts w:ascii="Calibri" w:hAnsi="Calibri"/>
+                <w:b/>
+                <w:color w:val="CC3333"/>
+                <w:sz w:val="20"/>
+                <w:lang w:val="es-ES"/>
+              </w:rPr>
+              <w:t>Alta</w:t>
+            </w:r>
+          </w:p>
+        </w:tc>
+        <w:tc>
+          <w:tcPr>
+            <w:tcW w:w="1701" w:type="dxa"/>
+            <w:shd w:val="clear" w:color="auto" w:fill="FFFFFF"/>
+            <w:vAlign w:val="center"/>
+          </w:tcPr>
+          <w:p>
+            <w:pPr>
+              <w:spacing w:before="40" w:after="40"/>
+              <w:rPr>
+                <w:lang w:val="es-ES"/>
+              </w:rPr>
+            </w:pPr>
+            <w:r>
+              <w:rPr>
+                <w:rFonts w:ascii="Calibri" w:hAnsi="Calibri"/>
+                <w:color w:val="000000"/>
+                <w:sz w:val="20"/>
+                <w:lang w:val="es-ES"/>
+              </w:rPr>
+              <w:t>Dev/</w:t>
+            </w:r>
+            <w:proofErr w:type="spellStart"/>
+            <w:r>
+              <w:rPr>
+                <w:rFonts w:ascii="Calibri" w:hAnsi="Calibri"/>
+                <w:color w:val="000000"/>
+                <w:sz w:val="20"/>
+                <w:lang w:val="es-ES"/>
+              </w:rPr>
+              <w:t>Ops</w:t>
+            </w:r>
+            <w:proofErr w:type="spellEnd"/>
+          </w:p>
+        </w:tc>
+        <w:tc>
+          <w:tcPr>
+            <w:tcW w:w="1417" w:type="dxa"/>
+            <w:shd w:val="clear" w:color="auto" w:fill="FFFFFF"/>
+            <w:vAlign w:val="center"/>
+          </w:tcPr>
+          <w:p>
+            <w:pPr>
+              <w:spacing w:before="40" w:after="40"/>
+              <w:jc w:val="center"/>
+              <w:rPr>
+                <w:lang w:val="es-ES"/>
+              </w:rPr>
+            </w:pPr>
+            <w:r>
+              <w:rPr>
+                <w:rFonts w:ascii="Calibri" w:hAnsi="Calibri"/>
+                <w:color w:val="000000"/>
+                <w:sz w:val="20"/>
+                <w:lang w:val="es-ES"/>
+              </w:rPr>
+              <w:t>Sprint 1</w:t>
+            </w:r>
+          </w:p>
+        </w:tc>
+        <w:tc>
+          <w:tcPr>
+            <w:tcW w:w="1417" w:type="dxa"/>
+            <w:shd w:val="clear" w:color="auto" w:fill="FFFFFF"/>
+            <w:vAlign w:val="center"/>
+          </w:tcPr>
+          <w:p>
+            <w:pPr>
+              <w:spacing w:before="40" w:after="40"/>
+              <w:jc w:val="center"/>
+              <w:rPr>
+                <w:lang w:val="es-ES"/>
+              </w:rPr>
+            </w:pPr>
+            <w:r>
+              <w:rPr>
+                <w:rFonts w:ascii="Calibri" w:hAnsi="Calibri"/>
+                <w:color w:val="000000"/>
+                <w:sz w:val="20"/>
+                <w:lang w:val="es-ES"/>
+              </w:rPr>
+              <w:t>Build Docker exitoso en &lt; 5 min; 0 errores de contenedor en producción</w:t>
+            </w:r>
+          </w:p>
+        </w:tc>
+      </w:tr>
+      <w:tr>
+        <w:trPr>
+          <w:jc w:val="center"/>
+        </w:trPr>
+        <w:tc>
+          <w:tcPr>
+            <w:tcW w:w="4252" w:type="dxa"/>
+            <w:shd w:val="clear" w:color="auto" w:fill="F4F6FA"/>
+            <w:vAlign w:val="center"/>
+          </w:tcPr>
+          <w:p>
+            <w:pPr>
+              <w:spacing w:before="40" w:after="40"/>
+              <w:rPr>
+                <w:lang w:val="es-ES"/>
+              </w:rPr>
+            </w:pPr>
+            <w:r>
+              <w:rPr>
+                <w:rFonts w:ascii="Calibri" w:hAnsi="Calibri"/>
+                <w:color w:val="000000"/>
+                <w:sz w:val="20"/>
+                <w:lang w:val="es-ES"/>
+              </w:rPr>
+              <w:t xml:space="preserve">CI/CD GitHub </w:t>
+            </w:r>
+            <w:proofErr w:type="spellStart"/>
+            <w:r>
+              <w:rPr>
+                <w:rFonts w:ascii="Calibri" w:hAnsi="Calibri"/>
+                <w:color w:val="000000"/>
+                <w:sz w:val="20"/>
+                <w:lang w:val="es-ES"/>
+              </w:rPr>
+              <w:t>Actions</w:t>
+            </w:r>
+            <w:proofErr w:type="spellEnd"/>
+            <w:r>
+              <w:rPr>
+                <w:rFonts w:ascii="Calibri" w:hAnsi="Calibri"/>
+                <w:color w:val="000000"/>
+                <w:sz w:val="20"/>
+                <w:lang w:val="es-ES"/>
+              </w:rPr>
+              <w:t xml:space="preserve">: </w:t>
+            </w:r>
+            <w:proofErr w:type="spellStart"/>
+            <w:r>
+              <w:rPr>
+                <w:rFonts w:ascii="Calibri" w:hAnsi="Calibri"/>
+                <w:color w:val="000000"/>
+                <w:sz w:val="20"/>
+                <w:lang w:val="es-ES"/>
+              </w:rPr>
+              <w:t>push</w:t>
+            </w:r>
+            <w:proofErr w:type="spellEnd"/>
+            <w:r>
+              <w:rPr>
+                <w:rFonts w:ascii="Calibri" w:hAnsi="Calibri"/>
+                <w:color w:val="000000"/>
+                <w:sz w:val="20"/>
+                <w:lang w:val="es-ES"/>
+              </w:rPr>
+              <w:t xml:space="preserve"> → </w:t>
+            </w:r>
+            <w:proofErr w:type="spellStart"/>
+            <w:r>
+              <w:rPr>
+                <w:rFonts w:ascii="Calibri" w:hAnsi="Calibri"/>
+                <w:color w:val="000000"/>
+                <w:sz w:val="20"/>
+                <w:lang w:val="es-ES"/>
+              </w:rPr>
+              <w:t>build</w:t>
+            </w:r>
+            <w:proofErr w:type="spellEnd"/>
+            <w:r>
+              <w:rPr>
+                <w:rFonts w:ascii="Calibri" w:hAnsi="Calibri"/>
+                <w:color w:val="000000"/>
+                <w:sz w:val="20"/>
+                <w:lang w:val="es-ES"/>
+              </w:rPr>
+              <w:t xml:space="preserve"> → test → </w:t>
+            </w:r>
+            <w:proofErr w:type="spellStart"/>
+            <w:r>
+              <w:rPr>
+                <w:rFonts w:ascii="Calibri" w:hAnsi="Calibri"/>
+                <w:color w:val="000000"/>
+                <w:sz w:val="20"/>
+                <w:lang w:val="es-ES"/>
+              </w:rPr>
+              <w:t>deploy</w:t>
+            </w:r>
+            <w:proofErr w:type="spellEnd"/>
+            <w:r>
+              <w:rPr>
+                <w:rFonts w:ascii="Calibri" w:hAnsi="Calibri"/>
+                <w:color w:val="000000"/>
+                <w:sz w:val="20"/>
+                <w:lang w:val="es-ES"/>
+              </w:rPr>
+              <w:t xml:space="preserve"> automático</w:t>
+            </w:r>
+          </w:p>
+        </w:tc>
+        <w:tc>
+          <w:tcPr>
+            <w:tcW w:w="1247" w:type="dxa"/>
+            <w:shd w:val="clear" w:color="auto" w:fill="F4F6FA"/>
+            <w:vAlign w:val="center"/>
+          </w:tcPr>
+          <w:p>
+            <w:pPr>
+              <w:spacing w:before="40" w:after="40"/>
+              <w:jc w:val="center"/>
+              <w:rPr>
+                <w:lang w:val="es-ES"/>
+              </w:rPr>
+            </w:pPr>
+            <w:r>
+              <w:rPr>
+                <w:rFonts w:ascii="Calibri" w:hAnsi="Calibri"/>
+                <w:b/>
+                <w:color w:val="E68A00"/>
+                <w:sz w:val="20"/>
+                <w:lang w:val="es-ES"/>
+              </w:rPr>
+              <w:t>Media</w:t>
+            </w:r>
+          </w:p>
+        </w:tc>
+        <w:tc>
+          <w:tcPr>
+            <w:tcW w:w="1701" w:type="dxa"/>
+            <w:shd w:val="clear" w:color="auto" w:fill="F4F6FA"/>
+            <w:vAlign w:val="center"/>
+          </w:tcPr>
+          <w:p>
+            <w:pPr>
+              <w:spacing w:before="40" w:after="40"/>
+              <w:rPr>
+                <w:lang w:val="es-ES"/>
+              </w:rPr>
+            </w:pPr>
+            <w:r>
+              <w:rPr>
+                <w:rFonts w:ascii="Calibri" w:hAnsi="Calibri"/>
+                <w:color w:val="000000"/>
+                <w:sz w:val="20"/>
+                <w:lang w:val="es-ES"/>
+              </w:rPr>
+              <w:t>Dev/</w:t>
+            </w:r>
+            <w:proofErr w:type="spellStart"/>
+            <w:r>
+              <w:rPr>
+                <w:rFonts w:ascii="Calibri" w:hAnsi="Calibri"/>
+                <w:color w:val="000000"/>
+                <w:sz w:val="20"/>
+                <w:lang w:val="es-ES"/>
+              </w:rPr>
+              <w:t>Ops</w:t>
+            </w:r>
+            <w:proofErr w:type="spellEnd"/>
+          </w:p>
+        </w:tc>
+        <w:tc>
+          <w:tcPr>
+            <w:tcW w:w="1417" w:type="dxa"/>
+            <w:shd w:val="clear" w:color="auto" w:fill="F4F6FA"/>
+            <w:vAlign w:val="center"/>
+          </w:tcPr>
+          <w:p>
+            <w:pPr>
+              <w:spacing w:before="40" w:after="40"/>
+              <w:jc w:val="center"/>
+              <w:rPr>
+                <w:lang w:val="es-ES"/>
+              </w:rPr>
+            </w:pPr>
+            <w:r>
+              <w:rPr>
+                <w:rFonts w:ascii="Calibri" w:hAnsi="Calibri"/>
+                <w:color w:val="000000"/>
+                <w:sz w:val="20"/>
+                <w:lang w:val="es-ES"/>
+              </w:rPr>
               <w:t>Sprint 2</w:t>
+            </w:r>
+          </w:p>
+        </w:tc>
+        <w:tc>
+          <w:tcPr>
+            <w:tcW w:w="1417" w:type="dxa"/>
+            <w:shd w:val="clear" w:color="auto" w:fill="F4F6FA"/>
+            <w:vAlign w:val="center"/>
+          </w:tcPr>
+          <w:p>
+            <w:pPr>
+              <w:spacing w:before="40" w:after="40"/>
+              <w:jc w:val="center"/>
+              <w:rPr>
+                <w:lang w:val="es-ES"/>
+              </w:rPr>
+            </w:pPr>
+            <w:r>
+              <w:rPr>
+                <w:rFonts w:ascii="Calibri" w:hAnsi="Calibri"/>
+                <w:color w:val="000000"/>
+                <w:sz w:val="20"/>
+                <w:lang w:val="es-ES"/>
+              </w:rPr>
+              <w:t>0 deploys fallidos consecutivos; cobertura de tests ≥ 80%</w:t>
             </w:r>
           </w:p>
         </w:tc>
@@ -4762,10 +5629,11 @@
         <w:tblLook w:val="04A0" w:firstRow="1" w:lastRow="0" w:firstColumn="1" w:lastColumn="0" w:noHBand="0" w:noVBand="1"/>
       </w:tblPr>
       <w:tblGrid>
-        <w:gridCol w:w="4252"/>
-        <w:gridCol w:w="1247"/>
-        <w:gridCol w:w="1701"/>
-        <w:gridCol w:w="1417"/>
+        <w:gridCol w:w="3784"/>
+        <w:gridCol w:w="1206"/>
+        <w:gridCol w:w="1634"/>
+        <w:gridCol w:w="1360"/>
+        <w:gridCol w:w="1366"/>
       </w:tblGrid>
       <w:tr>
         <w:trPr>
@@ -4875,6 +5743,32 @@
             </w:r>
           </w:p>
         </w:tc>
+        <w:tc>
+          <w:tcPr>
+            <w:tcW w:w="1417" w:type="dxa"/>
+            <w:shd w:val="clear" w:color="auto" w:fill="003987"/>
+            <w:vAlign w:val="center"/>
+          </w:tcPr>
+          <w:p>
+            <w:pPr>
+              <w:spacing w:before="60" w:after="60"/>
+              <w:jc w:val="center"/>
+              <w:rPr>
+                <w:lang w:val="es-ES"/>
+              </w:rPr>
+            </w:pPr>
+            <w:r>
+              <w:rPr>
+                <w:rFonts w:ascii="Calibri" w:hAnsi="Calibri"/>
+                <w:b/>
+                <w:color w:val="FFFFFF"/>
+                <w:sz w:val="20"/>
+                <w:lang w:val="es-ES"/>
+              </w:rPr>
+              <w:t>Métrica de éxito</w:t>
+            </w:r>
+          </w:p>
+        </w:tc>
       </w:tr>
       <w:tr>
         <w:trPr>
@@ -4990,6 +5884,31 @@
             </w:r>
           </w:p>
         </w:tc>
+        <w:tc>
+          <w:tcPr>
+            <w:tcW w:w="1417" w:type="dxa"/>
+            <w:shd w:val="clear" w:color="auto" w:fill="FFFFFF"/>
+            <w:vAlign w:val="center"/>
+          </w:tcPr>
+          <w:p>
+            <w:pPr>
+              <w:spacing w:before="40" w:after="40"/>
+              <w:jc w:val="center"/>
+              <w:rPr>
+                <w:lang w:val="es-ES"/>
+              </w:rPr>
+            </w:pPr>
+            <w:r>
+              <w:rPr>
+                <w:rFonts w:ascii="Calibri" w:hAnsi="Calibri"/>
+                <w:color w:val="000000"/>
+                <w:sz w:val="20"/>
+                <w:lang w:val="es-ES"/>
+              </w:rPr>
+              <w:t>≥ 80% de adopción por equipo de campo en primeras 4 semanas</w:t>
+            </w:r>
+          </w:p>
+        </w:tc>
       </w:tr>
       <w:tr>
         <w:trPr>
@@ -5094,6 +6013,31 @@
             </w:r>
           </w:p>
         </w:tc>
+        <w:tc>
+          <w:tcPr>
+            <w:tcW w:w="1417" w:type="dxa"/>
+            <w:shd w:val="clear" w:color="auto" w:fill="F4F6FA"/>
+            <w:vAlign w:val="center"/>
+          </w:tcPr>
+          <w:p>
+            <w:pPr>
+              <w:spacing w:before="40" w:after="40"/>
+              <w:jc w:val="center"/>
+              <w:rPr>
+                <w:lang w:val="es-ES"/>
+              </w:rPr>
+            </w:pPr>
+            <w:r>
+              <w:rPr>
+                <w:rFonts w:ascii="Calibri" w:hAnsi="Calibri"/>
+                <w:color w:val="000000"/>
+                <w:sz w:val="20"/>
+                <w:lang w:val="es-ES"/>
+              </w:rPr>
+              <w:t>Tiempo de respuesta &lt; 24 h tras alerta; 0 alertas ignoradas</w:t>
+            </w:r>
+          </w:p>
+        </w:tc>
       </w:tr>
       <w:tr>
         <w:trPr>
@@ -5215,6 +6159,31 @@
                 <w:lang w:val="es-ES"/>
               </w:rPr>
               <w:t>Trimestral</w:t>
+            </w:r>
+          </w:p>
+        </w:tc>
+        <w:tc>
+          <w:tcPr>
+            <w:tcW w:w="1417" w:type="dxa"/>
+            <w:shd w:val="clear" w:color="auto" w:fill="FFFFFF"/>
+            <w:vAlign w:val="center"/>
+          </w:tcPr>
+          <w:p>
+            <w:pPr>
+              <w:spacing w:before="40" w:after="40"/>
+              <w:jc w:val="center"/>
+              <w:rPr>
+                <w:lang w:val="es-ES"/>
+              </w:rPr>
+            </w:pPr>
+            <w:r>
+              <w:rPr>
+                <w:rFonts w:ascii="Calibri" w:hAnsi="Calibri"/>
+                <w:color w:val="000000"/>
+                <w:sz w:val="20"/>
+                <w:lang w:val="es-ES"/>
+              </w:rPr>
+              <w:t>100% entregas puntuales; 0 errores de cálculo en reportes mensuales</w:t>
             </w:r>
           </w:p>
         </w:tc>
@@ -5332,7 +6301,16 @@
           <w:color w:val="000000"/>
           <w:lang w:val="es-ES"/>
         </w:rPr>
-        <w:t xml:space="preserve">. Los factores evaluados incluyen integración con el </w:t>
+        <w:t xml:space="preserve">. Los factores </w:t>
+      </w:r>
+      <w:r>
+        <w:rPr>
+          <w:rFonts w:ascii="Calibri" w:hAnsi="Calibri"/>
+          <w:color w:val="000000"/>
+          <w:lang w:val="es-ES"/>
+        </w:rPr>
+        <w:lastRenderedPageBreak/>
+        <w:t xml:space="preserve">evaluados incluyen integración con el </w:t>
       </w:r>
       <w:proofErr w:type="spellStart"/>
       <w:r>
@@ -5893,7 +6871,6 @@
                 <w:sz w:val="20"/>
                 <w:lang w:val="es-ES"/>
               </w:rPr>
-              <w:lastRenderedPageBreak/>
               <w:t>Base de datos</w:t>
             </w:r>
           </w:p>
@@ -8816,6 +9793,7 @@
           <w:sz w:val="24"/>
           <w:lang w:val="es-ES"/>
         </w:rPr>
+        <w:lastRenderedPageBreak/>
         <w:t xml:space="preserve">4.3 Justificación: Google Cloud </w:t>
       </w:r>
       <w:proofErr w:type="spellStart"/>
@@ -9075,7 +10053,6 @@
           <w:color w:val="003987"/>
           <w:lang w:val="es-ES"/>
         </w:rPr>
-        <w:lastRenderedPageBreak/>
         <w:t xml:space="preserve">Costo competitivo para escala del proyecto: </w:t>
       </w:r>
       <w:r>
@@ -10552,6 +11529,7 @@
                 <w:sz w:val="20"/>
                 <w:lang w:val="es-ES"/>
               </w:rPr>
+              <w:lastRenderedPageBreak/>
               <w:t>API / Inferencia</w:t>
             </w:r>
           </w:p>
@@ -11380,7 +12358,6 @@
                 <w:sz w:val="20"/>
                 <w:lang w:val="es-ES"/>
               </w:rPr>
-              <w:lastRenderedPageBreak/>
               <w:t>Dashboard</w:t>
             </w:r>
             <w:proofErr w:type="spellEnd"/>
@@ -13332,6 +14309,7 @@
           <w:sz w:val="20"/>
           <w:lang w:val="es-ES"/>
         </w:rPr>
+        <w:lastRenderedPageBreak/>
         <w:t xml:space="preserve">NOTA: Esta sección distingue explícitamente entre (a) </w:t>
       </w:r>
       <w:proofErr w:type="spellStart"/>
@@ -13824,7 +14802,6 @@
                 <w:sz w:val="20"/>
                 <w:lang w:val="es-ES"/>
               </w:rPr>
-              <w:lastRenderedPageBreak/>
               <w:t>Latencia P50</w:t>
             </w:r>
           </w:p>
@@ -15950,6 +16927,7 @@
                 <w:sz w:val="20"/>
                 <w:lang w:val="es-ES"/>
               </w:rPr>
+              <w:lastRenderedPageBreak/>
               <w:t>Servicio caído</w:t>
             </w:r>
           </w:p>
@@ -16631,7 +17609,6 @@
           <w:sz w:val="28"/>
           <w:lang w:val="es-ES"/>
         </w:rPr>
-        <w:lastRenderedPageBreak/>
         <w:t xml:space="preserve">6. Objetivo 4.5 — Seguridad, PII y </w:t>
       </w:r>
       <w:proofErr w:type="spellStart"/>
@@ -18821,6 +19798,7 @@
           <w:sz w:val="24"/>
           <w:lang w:val="es-ES"/>
         </w:rPr>
+        <w:lastRenderedPageBreak/>
         <w:t>6.3 Controles de Seguridad por Capa</w:t>
       </w:r>
     </w:p>
@@ -19063,7 +20041,6 @@
           <w:color w:val="000000"/>
           <w:lang w:val="es-ES"/>
         </w:rPr>
-        <w:lastRenderedPageBreak/>
         <w:t xml:space="preserve">Cloud Storage: encriptación AES-256 por defecto. Para datos sensibles, usar </w:t>
       </w:r>
       <w:proofErr w:type="spellStart"/>
@@ -20520,6 +21497,7 @@
                 <w:sz w:val="20"/>
                 <w:lang w:val="es-ES"/>
               </w:rPr>
+              <w:lastRenderedPageBreak/>
               <w:t>2. Clasificación</w:t>
             </w:r>
           </w:p>
@@ -21133,17 +22111,7 @@
                 <w:sz w:val="20"/>
                 <w:lang w:val="es-ES"/>
               </w:rPr>
-              <w:t xml:space="preserve">6. </w:t>
-            </w:r>
-            <w:r>
-              <w:rPr>
-                <w:rFonts w:ascii="Calibri" w:hAnsi="Calibri"/>
-                <w:color w:val="000000"/>
-                <w:sz w:val="20"/>
-                <w:lang w:val="es-ES"/>
-              </w:rPr>
-              <w:lastRenderedPageBreak/>
-              <w:t>Recuperación</w:t>
+              <w:t>6. Recuperación</w:t>
             </w:r>
           </w:p>
         </w:tc>
@@ -21167,18 +22135,7 @@
                 <w:sz w:val="20"/>
                 <w:lang w:val="es-ES"/>
               </w:rPr>
-              <w:lastRenderedPageBreak/>
-              <w:t xml:space="preserve">Restaurar servicio, verificar </w:t>
-            </w:r>
-            <w:r>
-              <w:rPr>
-                <w:rFonts w:ascii="Calibri" w:hAnsi="Calibri"/>
-                <w:color w:val="000000"/>
-                <w:sz w:val="20"/>
-                <w:lang w:val="es-ES"/>
-              </w:rPr>
-              <w:lastRenderedPageBreak/>
-              <w:t>integridad de datos</w:t>
+              <w:t>Restaurar servicio, verificar integridad de datos</w:t>
             </w:r>
           </w:p>
         </w:tc>
@@ -21202,18 +22159,7 @@
                 <w:sz w:val="20"/>
                 <w:lang w:val="es-ES"/>
               </w:rPr>
-              <w:lastRenderedPageBreak/>
-              <w:t xml:space="preserve">Equipo </w:t>
-            </w:r>
-            <w:r>
-              <w:rPr>
-                <w:rFonts w:ascii="Calibri" w:hAnsi="Calibri"/>
-                <w:color w:val="000000"/>
-                <w:sz w:val="20"/>
-                <w:lang w:val="es-ES"/>
-              </w:rPr>
-              <w:lastRenderedPageBreak/>
-              <w:t>técnico</w:t>
+              <w:t>Equipo técnico</w:t>
             </w:r>
           </w:p>
         </w:tc>
@@ -21237,7 +22183,6 @@
                 <w:sz w:val="20"/>
                 <w:lang w:val="es-ES"/>
               </w:rPr>
-              <w:lastRenderedPageBreak/>
               <w:t>&lt; 2 h (P1)</w:t>
             </w:r>
           </w:p>
@@ -22902,6 +23847,7 @@
           <w:sz w:val="24"/>
           <w:lang w:val="es-ES"/>
         </w:rPr>
+        <w:lastRenderedPageBreak/>
         <w:t xml:space="preserve">7.2 </w:t>
       </w:r>
       <w:proofErr w:type="spellStart"/>
@@ -23505,17 +24451,7 @@
                 <w:sz w:val="20"/>
                 <w:lang w:val="es-ES"/>
               </w:rPr>
-              <w:t xml:space="preserve"> a versión </w:t>
-            </w:r>
-            <w:r>
-              <w:rPr>
-                <w:rFonts w:ascii="Calibri" w:hAnsi="Calibri"/>
-                <w:color w:val="000000"/>
-                <w:sz w:val="20"/>
-                <w:lang w:val="es-ES"/>
-              </w:rPr>
-              <w:lastRenderedPageBreak/>
-              <w:t>anterior</w:t>
+              <w:t xml:space="preserve"> a versión anterior</w:t>
             </w:r>
           </w:p>
         </w:tc>
@@ -23540,18 +24476,7 @@
                 <w:sz w:val="20"/>
                 <w:lang w:val="es-ES"/>
               </w:rPr>
-              <w:lastRenderedPageBreak/>
-              <w:t xml:space="preserve">Ante degradación </w:t>
-            </w:r>
-            <w:r>
-              <w:rPr>
-                <w:rFonts w:ascii="Calibri" w:hAnsi="Calibri"/>
-                <w:color w:val="000000"/>
-                <w:sz w:val="20"/>
-                <w:lang w:val="es-ES"/>
-              </w:rPr>
-              <w:lastRenderedPageBreak/>
-              <w:t>SLO</w:t>
+              <w:t>Ante degradación SLO</w:t>
             </w:r>
           </w:p>
         </w:tc>
@@ -23575,7 +24500,6 @@
                 <w:sz w:val="20"/>
                 <w:lang w:val="es-ES"/>
               </w:rPr>
-              <w:lastRenderedPageBreak/>
               <w:t xml:space="preserve">Identificar versión estable → </w:t>
             </w:r>
             <w:proofErr w:type="spellStart"/>
@@ -23606,7 +24530,6 @@
                 <w:sz w:val="20"/>
                 <w:lang w:val="es-ES"/>
               </w:rPr>
-              <w:lastRenderedPageBreak/>
               <w:t>services</w:t>
             </w:r>
             <w:proofErr w:type="spellEnd"/>
@@ -23662,7 +24585,6 @@
                 <w:sz w:val="20"/>
                 <w:lang w:val="es-ES"/>
               </w:rPr>
-              <w:lastRenderedPageBreak/>
               <w:t>&lt; 10 min</w:t>
             </w:r>
           </w:p>
@@ -25168,6 +26090,7 @@
           <w:color w:val="000000"/>
           <w:lang w:val="es-ES"/>
         </w:rPr>
+        <w:lastRenderedPageBreak/>
         <w:t xml:space="preserve">Firma del Acta de Entrega por parte del </w:t>
       </w:r>
       <w:proofErr w:type="gramStart"/>
@@ -25763,7 +26686,6 @@
                 <w:sz w:val="20"/>
                 <w:lang w:val="es-ES"/>
               </w:rPr>
-              <w:lastRenderedPageBreak/>
               <w:t>4.</w:t>
             </w:r>
           </w:p>
@@ -26772,6 +27694,7 @@
           <w:color w:val="003987"/>
           <w:lang w:val="es-ES"/>
         </w:rPr>
+        <w:lastRenderedPageBreak/>
         <w:t xml:space="preserve">6. Impacto práctico y ROI: </w:t>
       </w:r>
       <w:r>

</xml_diff>

<commit_message>
Update conclusions DOCX and add temp file
Replace docs/Conclusiones_Clave_Equipo48_V2.docx with an updated binary version and add the Office temporary file docs/~$nclusiones_Clave_Equipo48_V2.docx. The added file appears to be an editor lock/temp file and should likely be removed and added to .gitignore to avoid committing transient files.
</commit_message>
<xml_diff>
--- a/docs/Conclusiones_Clave_Equipo48_V2.docx
+++ b/docs/Conclusiones_Clave_Equipo48_V2.docx
@@ -429,6 +429,18 @@
       <w:pPr>
         <w:spacing w:before="240" w:after="60"/>
         <w:rPr>
+          <w:rFonts w:ascii="Calibri" w:hAnsi="Calibri"/>
+          <w:b/>
+          <w:color w:val="003987"/>
+          <w:sz w:val="24"/>
+          <w:lang w:val="es-ES"/>
+        </w:rPr>
+      </w:pPr>
+    </w:p>
+    <w:p>
+      <w:pPr>
+        <w:spacing w:before="240" w:after="60"/>
+        <w:rPr>
           <w:lang w:val="es-ES"/>
         </w:rPr>
       </w:pPr>
@@ -1614,6 +1626,21 @@
         </w:pBdr>
         <w:spacing w:before="360" w:after="80"/>
         <w:rPr>
+          <w:rFonts w:ascii="Calibri" w:hAnsi="Calibri"/>
+          <w:b/>
+          <w:color w:val="003987"/>
+          <w:sz w:val="28"/>
+          <w:lang w:val="es-ES"/>
+        </w:rPr>
+      </w:pPr>
+    </w:p>
+    <w:p>
+      <w:pPr>
+        <w:pBdr>
+          <w:bottom w:val="single" w:sz="6" w:space="1" w:color="003987"/>
+        </w:pBdr>
+        <w:spacing w:before="360" w:after="80"/>
+        <w:rPr>
           <w:lang w:val="es-ES"/>
         </w:rPr>
       </w:pPr>
@@ -2948,30 +2975,6 @@
       <w:pPr>
         <w:spacing w:before="240" w:after="60"/>
         <w:rPr>
-          <w:rFonts w:ascii="Calibri" w:hAnsi="Calibri"/>
-          <w:b/>
-          <w:color w:val="003987"/>
-          <w:sz w:val="24"/>
-          <w:lang w:val="es-ES"/>
-        </w:rPr>
-      </w:pPr>
-    </w:p>
-    <w:p>
-      <w:pPr>
-        <w:spacing w:before="240" w:after="60"/>
-        <w:rPr>
-          <w:rFonts w:ascii="Calibri" w:hAnsi="Calibri"/>
-          <w:b/>
-          <w:color w:val="003987"/>
-          <w:sz w:val="24"/>
-          <w:lang w:val="es-ES"/>
-        </w:rPr>
-      </w:pPr>
-    </w:p>
-    <w:p>
-      <w:pPr>
-        <w:spacing w:before="240" w:after="60"/>
-        <w:rPr>
           <w:lang w:val="es-ES"/>
         </w:rPr>
       </w:pPr>
@@ -3029,6 +3032,18 @@
       <w:pPr>
         <w:spacing w:before="240" w:after="60"/>
         <w:rPr>
+          <w:rFonts w:ascii="Calibri" w:hAnsi="Calibri"/>
+          <w:b/>
+          <w:color w:val="003987"/>
+          <w:sz w:val="24"/>
+          <w:lang w:val="es-ES"/>
+        </w:rPr>
+      </w:pPr>
+    </w:p>
+    <w:p>
+      <w:pPr>
+        <w:spacing w:before="240" w:after="60"/>
+        <w:rPr>
           <w:lang w:val="es-ES"/>
         </w:rPr>
       </w:pPr>
@@ -3059,6 +3074,18 @@
         </w:rPr>
         <w:t>El rango típico de emisión de metano en el hato es 14–28 g CH4/kg leche (amplitud = 14). Un RMSE de 0.6117 representa un error relativo del 4.4% sobre este rango, con un MAPE de 3.06%. En términos prácticos: si una vaca emite 20 g CH4/kg leche, el modelo predice entre 19.4 y 20.6 g CH4/kg leche en el 68% de los casos (intervalo ±1 RMSE). Este nivel de precisión es suficiente para: (1) detectar vacas en zona Alto (&gt;25 g) con alta confianza, (2) priorizar intervenciones nutricionales, y (3) monitorear tendencias de hato sin requerir equipos de laboratorio costosos en cada visita.</w:t>
       </w:r>
+    </w:p>
+    <w:p>
+      <w:pPr>
+        <w:spacing w:before="240" w:after="60"/>
+        <w:rPr>
+          <w:rFonts w:ascii="Calibri" w:hAnsi="Calibri"/>
+          <w:b/>
+          <w:color w:val="003987"/>
+          <w:sz w:val="24"/>
+          <w:lang w:val="es-ES"/>
+        </w:rPr>
+      </w:pPr>
     </w:p>
     <w:p>
       <w:pPr>
@@ -3313,6 +3340,18 @@
         </w:rPr>
         <w:t xml:space="preserve"> y actuar sobre vacas con más de 5 alertas acumuladas de nivel Alto.</w:t>
       </w:r>
+    </w:p>
+    <w:p>
+      <w:pPr>
+        <w:spacing w:before="240" w:after="60"/>
+        <w:rPr>
+          <w:rFonts w:ascii="Calibri" w:hAnsi="Calibri"/>
+          <w:b/>
+          <w:color w:val="003987"/>
+          <w:sz w:val="24"/>
+          <w:lang w:val="es-ES"/>
+        </w:rPr>
+      </w:pPr>
     </w:p>
     <w:p>
       <w:pPr>
@@ -3578,6 +3617,7 @@
                 <w:sz w:val="20"/>
                 <w:lang w:val="es-ES"/>
               </w:rPr>
+              <w:lastRenderedPageBreak/>
               <w:t>Fallo del servicio GCP</w:t>
             </w:r>
           </w:p>
@@ -3764,7 +3804,6 @@
                 <w:sz w:val="20"/>
                 <w:lang w:val="es-ES"/>
               </w:rPr>
-              <w:lastRenderedPageBreak/>
               <w:t>Datos de razas minoritarias</w:t>
             </w:r>
           </w:p>
@@ -3972,6 +4011,18 @@
         </w:rPr>
         <w:t>A partir de los hallazgos obtenidos durante el modelado (E3–E5), se identifican las medidas concretas que deben tomarse para garantizar el éxito del proyecto en producción.</w:t>
       </w:r>
+    </w:p>
+    <w:p>
+      <w:pPr>
+        <w:spacing w:before="240" w:after="60"/>
+        <w:rPr>
+          <w:rFonts w:ascii="Calibri" w:hAnsi="Calibri"/>
+          <w:b/>
+          <w:color w:val="003987"/>
+          <w:sz w:val="24"/>
+          <w:lang w:val="es-ES"/>
+        </w:rPr>
+      </w:pPr>
     </w:p>
     <w:p>
       <w:pPr>
@@ -4571,17 +4622,54 @@
       <w:pPr>
         <w:spacing w:before="240" w:after="60"/>
         <w:rPr>
-          <w:lang w:val="es-ES"/>
-        </w:rPr>
-      </w:pPr>
-      <w:r>
-        <w:rPr>
           <w:rFonts w:ascii="Calibri" w:hAnsi="Calibri"/>
           <w:b/>
           <w:color w:val="003987"/>
           <w:sz w:val="24"/>
           <w:lang w:val="es-ES"/>
         </w:rPr>
+      </w:pPr>
+    </w:p>
+    <w:p>
+      <w:pPr>
+        <w:spacing w:before="240" w:after="60"/>
+        <w:rPr>
+          <w:rFonts w:ascii="Calibri" w:hAnsi="Calibri"/>
+          <w:b/>
+          <w:color w:val="003987"/>
+          <w:sz w:val="24"/>
+          <w:lang w:val="es-ES"/>
+        </w:rPr>
+      </w:pPr>
+    </w:p>
+    <w:p>
+      <w:pPr>
+        <w:spacing w:before="240" w:after="60"/>
+        <w:rPr>
+          <w:rFonts w:ascii="Calibri" w:hAnsi="Calibri"/>
+          <w:b/>
+          <w:color w:val="003987"/>
+          <w:sz w:val="24"/>
+          <w:lang w:val="es-ES"/>
+        </w:rPr>
+      </w:pPr>
+    </w:p>
+    <w:p>
+      <w:pPr>
+        <w:spacing w:before="240" w:after="60"/>
+        <w:rPr>
+          <w:lang w:val="es-ES"/>
+        </w:rPr>
+      </w:pPr>
+      <w:r>
+        <w:rPr>
+          <w:rFonts w:ascii="Calibri" w:hAnsi="Calibri"/>
+          <w:b/>
+          <w:color w:val="003987"/>
+          <w:sz w:val="24"/>
+          <w:lang w:val="es-ES"/>
+        </w:rPr>
+        <w:lastRenderedPageBreak/>
         <w:t>3.2 Datos</w:t>
       </w:r>
     </w:p>
@@ -5029,9 +5117,20 @@
           <w:sz w:val="18"/>
           <w:lang w:val="es-ES"/>
         </w:rPr>
-        <w:lastRenderedPageBreak/>
         <w:t>Tabla 4. Acciones sobre los datos.</w:t>
       </w:r>
+    </w:p>
+    <w:p>
+      <w:pPr>
+        <w:spacing w:before="240" w:after="60"/>
+        <w:rPr>
+          <w:rFonts w:ascii="Calibri" w:hAnsi="Calibri"/>
+          <w:b/>
+          <w:color w:val="003987"/>
+          <w:sz w:val="24"/>
+          <w:lang w:val="es-ES"/>
+        </w:rPr>
+      </w:pPr>
     </w:p>
     <w:p>
       <w:pPr>
@@ -5590,6 +5689,18 @@
         </w:rPr>
         <w:t>Tabla 5. Acciones operativas.</w:t>
       </w:r>
+    </w:p>
+    <w:p>
+      <w:pPr>
+        <w:spacing w:before="240" w:after="60"/>
+        <w:rPr>
+          <w:rFonts w:ascii="Calibri" w:hAnsi="Calibri"/>
+          <w:b/>
+          <w:color w:val="003987"/>
+          <w:sz w:val="24"/>
+          <w:lang w:val="es-ES"/>
+        </w:rPr>
+      </w:pPr>
     </w:p>
     <w:p>
       <w:pPr>
@@ -6034,7 +6145,17 @@
                 <w:sz w:val="20"/>
                 <w:lang w:val="es-ES"/>
               </w:rPr>
-              <w:t>Tiempo de respuesta &lt; 24 h tras alerta; 0 alertas ignoradas</w:t>
+              <w:t xml:space="preserve">Tiempo de respuesta &lt; 24 h tras </w:t>
+            </w:r>
+            <w:r>
+              <w:rPr>
+                <w:rFonts w:ascii="Calibri" w:hAnsi="Calibri"/>
+                <w:color w:val="000000"/>
+                <w:sz w:val="20"/>
+                <w:lang w:val="es-ES"/>
+              </w:rPr>
+              <w:lastRenderedPageBreak/>
+              <w:t>alerta; 0 alertas ignoradas</w:t>
             </w:r>
           </w:p>
         </w:tc>
@@ -6063,6 +6184,7 @@
                 <w:sz w:val="20"/>
                 <w:lang w:val="es-ES"/>
               </w:rPr>
+              <w:lastRenderedPageBreak/>
               <w:t xml:space="preserve">Reporte mensual de hato para gerencia con </w:t>
             </w:r>
             <w:proofErr w:type="spellStart"/>
@@ -6237,6 +6359,21 @@
         </w:pBdr>
         <w:spacing w:before="360" w:after="80"/>
         <w:rPr>
+          <w:rFonts w:ascii="Calibri" w:hAnsi="Calibri"/>
+          <w:b/>
+          <w:color w:val="003987"/>
+          <w:sz w:val="28"/>
+          <w:lang w:val="es-ES"/>
+        </w:rPr>
+      </w:pPr>
+    </w:p>
+    <w:p>
+      <w:pPr>
+        <w:pBdr>
+          <w:bottom w:val="single" w:sz="6" w:space="1" w:color="003987"/>
+        </w:pBdr>
+        <w:spacing w:before="360" w:after="80"/>
+        <w:rPr>
           <w:lang w:val="es-ES"/>
         </w:rPr>
       </w:pPr>
@@ -6301,16 +6438,25 @@
           <w:color w:val="000000"/>
           <w:lang w:val="es-ES"/>
         </w:rPr>
-        <w:t xml:space="preserve">. Los factores </w:t>
-      </w:r>
+        <w:t xml:space="preserve">. Los factores evaluados incluyen integración con el </w:t>
+      </w:r>
+      <w:proofErr w:type="spellStart"/>
       <w:r>
         <w:rPr>
           <w:rFonts w:ascii="Calibri" w:hAnsi="Calibri"/>
           <w:color w:val="000000"/>
           <w:lang w:val="es-ES"/>
         </w:rPr>
-        <w:lastRenderedPageBreak/>
-        <w:t xml:space="preserve">evaluados incluyen integración con el </w:t>
+        <w:t>stack</w:t>
+      </w:r>
+      <w:proofErr w:type="spellEnd"/>
+      <w:r>
+        <w:rPr>
+          <w:rFonts w:ascii="Calibri" w:hAnsi="Calibri"/>
+          <w:color w:val="000000"/>
+          <w:lang w:val="es-ES"/>
+        </w:rPr>
+        <w:t xml:space="preserve"> tecnológico del proyecto (Python/</w:t>
       </w:r>
       <w:proofErr w:type="spellStart"/>
       <w:r>
@@ -6319,7 +6465,7 @@
           <w:color w:val="000000"/>
           <w:lang w:val="es-ES"/>
         </w:rPr>
-        <w:t>stack</w:t>
+        <w:t>sklearn</w:t>
       </w:r>
       <w:proofErr w:type="spellEnd"/>
       <w:r>
@@ -6328,7 +6474,7 @@
           <w:color w:val="000000"/>
           <w:lang w:val="es-ES"/>
         </w:rPr>
-        <w:t xml:space="preserve"> tecnológico del proyecto (Python/</w:t>
+        <w:t xml:space="preserve">), facilidad de uso, escalabilidad, costo, y soporte </w:t>
       </w:r>
       <w:proofErr w:type="spellStart"/>
       <w:r>
@@ -6337,7 +6483,7 @@
           <w:color w:val="000000"/>
           <w:lang w:val="es-ES"/>
         </w:rPr>
-        <w:t>sklearn</w:t>
+        <w:t>MLOps</w:t>
       </w:r>
       <w:proofErr w:type="spellEnd"/>
       <w:r>
@@ -6346,26 +6492,20 @@
           <w:color w:val="000000"/>
           <w:lang w:val="es-ES"/>
         </w:rPr>
-        <w:t xml:space="preserve">), facilidad de uso, escalabilidad, costo, y soporte </w:t>
-      </w:r>
-      <w:proofErr w:type="spellStart"/>
-      <w:r>
-        <w:rPr>
-          <w:rFonts w:ascii="Calibri" w:hAnsi="Calibri"/>
-          <w:color w:val="000000"/>
-          <w:lang w:val="es-ES"/>
-        </w:rPr>
-        <w:t>MLOps</w:t>
-      </w:r>
-      <w:proofErr w:type="spellEnd"/>
-      <w:r>
-        <w:rPr>
-          <w:rFonts w:ascii="Calibri" w:hAnsi="Calibri"/>
-          <w:color w:val="000000"/>
-          <w:lang w:val="es-ES"/>
-        </w:rPr>
         <w:t>.</w:t>
       </w:r>
+    </w:p>
+    <w:p>
+      <w:pPr>
+        <w:spacing w:before="240" w:after="60"/>
+        <w:rPr>
+          <w:rFonts w:ascii="Calibri" w:hAnsi="Calibri"/>
+          <w:b/>
+          <w:color w:val="003987"/>
+          <w:sz w:val="24"/>
+          <w:lang w:val="es-ES"/>
+        </w:rPr>
+      </w:pPr>
     </w:p>
     <w:p>
       <w:pPr>
@@ -8196,6 +8336,7 @@
           <w:sz w:val="24"/>
           <w:lang w:val="es-ES"/>
         </w:rPr>
+        <w:lastRenderedPageBreak/>
         <w:t xml:space="preserve">4.2 Matriz de </w:t>
       </w:r>
       <w:proofErr w:type="spellStart"/>
@@ -9782,18 +9923,29 @@
       <w:pPr>
         <w:spacing w:before="240" w:after="60"/>
         <w:rPr>
-          <w:lang w:val="es-ES"/>
-        </w:rPr>
-      </w:pPr>
-      <w:r>
-        <w:rPr>
           <w:rFonts w:ascii="Calibri" w:hAnsi="Calibri"/>
           <w:b/>
           <w:color w:val="003987"/>
           <w:sz w:val="24"/>
           <w:lang w:val="es-ES"/>
         </w:rPr>
-        <w:lastRenderedPageBreak/>
+      </w:pPr>
+    </w:p>
+    <w:p>
+      <w:pPr>
+        <w:spacing w:before="240" w:after="60"/>
+        <w:rPr>
+          <w:lang w:val="es-ES"/>
+        </w:rPr>
+      </w:pPr>
+      <w:r>
+        <w:rPr>
+          <w:rFonts w:ascii="Calibri" w:hAnsi="Calibri"/>
+          <w:b/>
+          <w:color w:val="003987"/>
+          <w:sz w:val="24"/>
+          <w:lang w:val="es-ES"/>
+        </w:rPr>
         <w:t xml:space="preserve">4.3 Justificación: Google Cloud </w:t>
       </w:r>
       <w:proofErr w:type="spellStart"/>
@@ -10421,17 +10573,30 @@
       <w:pPr>
         <w:spacing w:before="240" w:after="60"/>
         <w:rPr>
-          <w:lang w:val="es-ES"/>
-        </w:rPr>
-      </w:pPr>
-      <w:r>
-        <w:rPr>
           <w:rFonts w:ascii="Calibri" w:hAnsi="Calibri"/>
           <w:b/>
           <w:color w:val="003987"/>
           <w:sz w:val="24"/>
           <w:lang w:val="es-ES"/>
         </w:rPr>
+      </w:pPr>
+    </w:p>
+    <w:p>
+      <w:pPr>
+        <w:spacing w:before="240" w:after="60"/>
+        <w:rPr>
+          <w:lang w:val="es-ES"/>
+        </w:rPr>
+      </w:pPr>
+      <w:r>
+        <w:rPr>
+          <w:rFonts w:ascii="Calibri" w:hAnsi="Calibri"/>
+          <w:b/>
+          <w:color w:val="003987"/>
+          <w:sz w:val="24"/>
+          <w:lang w:val="es-ES"/>
+        </w:rPr>
+        <w:lastRenderedPageBreak/>
         <w:t>4.4 Arquitectura propuesta en GCP</w:t>
       </w:r>
     </w:p>
@@ -11251,6 +11416,18 @@
         </w:rPr>
         <w:t>Tabla 9. Arquitectura propuesta. Costo base estimado: ~$31 USD/mes.</w:t>
       </w:r>
+    </w:p>
+    <w:p>
+      <w:pPr>
+        <w:spacing w:before="240" w:after="60"/>
+        <w:rPr>
+          <w:rFonts w:ascii="Calibri" w:hAnsi="Calibri"/>
+          <w:b/>
+          <w:color w:val="003987"/>
+          <w:sz w:val="24"/>
+          <w:lang w:val="es-ES"/>
+        </w:rPr>
+      </w:pPr>
     </w:p>
     <w:p>
       <w:pPr>
@@ -11529,7 +11706,6 @@
                 <w:sz w:val="20"/>
                 <w:lang w:val="es-ES"/>
               </w:rPr>
-              <w:lastRenderedPageBreak/>
               <w:t>API / Inferencia</w:t>
             </w:r>
           </w:p>
@@ -12909,17 +13085,54 @@
       <w:pPr>
         <w:spacing w:before="240" w:after="60"/>
         <w:rPr>
-          <w:lang w:val="es-ES"/>
-        </w:rPr>
-      </w:pPr>
-      <w:r>
-        <w:rPr>
           <w:rFonts w:ascii="Calibri" w:hAnsi="Calibri"/>
           <w:b/>
           <w:color w:val="003987"/>
           <w:sz w:val="24"/>
           <w:lang w:val="es-ES"/>
         </w:rPr>
+      </w:pPr>
+    </w:p>
+    <w:p>
+      <w:pPr>
+        <w:spacing w:before="240" w:after="60"/>
+        <w:rPr>
+          <w:rFonts w:ascii="Calibri" w:hAnsi="Calibri"/>
+          <w:b/>
+          <w:color w:val="003987"/>
+          <w:sz w:val="24"/>
+          <w:lang w:val="es-ES"/>
+        </w:rPr>
+      </w:pPr>
+    </w:p>
+    <w:p>
+      <w:pPr>
+        <w:spacing w:before="240" w:after="60"/>
+        <w:rPr>
+          <w:rFonts w:ascii="Calibri" w:hAnsi="Calibri"/>
+          <w:b/>
+          <w:color w:val="003987"/>
+          <w:sz w:val="24"/>
+          <w:lang w:val="es-ES"/>
+        </w:rPr>
+      </w:pPr>
+    </w:p>
+    <w:p>
+      <w:pPr>
+        <w:spacing w:before="240" w:after="60"/>
+        <w:rPr>
+          <w:lang w:val="es-ES"/>
+        </w:rPr>
+      </w:pPr>
+      <w:r>
+        <w:rPr>
+          <w:rFonts w:ascii="Calibri" w:hAnsi="Calibri"/>
+          <w:b/>
+          <w:color w:val="003987"/>
+          <w:sz w:val="24"/>
+          <w:lang w:val="es-ES"/>
+        </w:rPr>
+        <w:lastRenderedPageBreak/>
         <w:t xml:space="preserve">4.6 </w:t>
       </w:r>
       <w:proofErr w:type="spellStart"/>
@@ -14159,6 +14372,18 @@
       <w:pPr>
         <w:spacing w:before="240" w:after="60"/>
         <w:rPr>
+          <w:rFonts w:ascii="Calibri" w:hAnsi="Calibri"/>
+          <w:b/>
+          <w:color w:val="003987"/>
+          <w:sz w:val="24"/>
+          <w:lang w:val="es-ES"/>
+        </w:rPr>
+      </w:pPr>
+    </w:p>
+    <w:p>
+      <w:pPr>
+        <w:spacing w:before="240" w:after="60"/>
+        <w:rPr>
           <w:lang w:val="es-ES"/>
         </w:rPr>
       </w:pPr>
@@ -14251,6 +14476,20 @@
     </w:p>
     <w:p>
       <w:pPr>
+        <w:pStyle w:val="Listaconvietas"/>
+        <w:numPr>
+          <w:ilvl w:val="0"/>
+          <w:numId w:val="0"/>
+        </w:numPr>
+        <w:spacing w:before="40" w:after="40"/>
+        <w:ind w:left="454"/>
+        <w:rPr>
+          <w:lang w:val="es-ES"/>
+        </w:rPr>
+      </w:pPr>
+    </w:p>
+    <w:p>
+      <w:pPr>
         <w:pBdr>
           <w:bottom w:val="single" w:sz="6" w:space="1" w:color="003987"/>
         </w:pBdr>
@@ -14294,90 +14533,15 @@
     </w:p>
     <w:p>
       <w:pPr>
-        <w:shd w:val="clear" w:color="auto" w:fill="FFF8E0"/>
-        <w:spacing w:before="120" w:after="120"/>
-        <w:ind w:left="283"/>
-        <w:rPr>
+        <w:spacing w:before="240" w:after="60"/>
+        <w:rPr>
+          <w:rFonts w:ascii="Calibri" w:hAnsi="Calibri"/>
+          <w:b/>
+          <w:color w:val="003987"/>
+          <w:sz w:val="24"/>
           <w:lang w:val="es-ES"/>
         </w:rPr>
       </w:pPr>
-      <w:r>
-        <w:rPr>
-          <w:rFonts w:ascii="Calibri" w:hAnsi="Calibri"/>
-          <w:i/>
-          <w:color w:val="554400"/>
-          <w:sz w:val="20"/>
-          <w:lang w:val="es-ES"/>
-        </w:rPr>
-        <w:lastRenderedPageBreak/>
-        <w:t xml:space="preserve">NOTA: Esta sección distingue explícitamente entre (a) </w:t>
-      </w:r>
-      <w:proofErr w:type="spellStart"/>
-      <w:r>
-        <w:rPr>
-          <w:rFonts w:ascii="Calibri" w:hAnsi="Calibri"/>
-          <w:i/>
-          <w:color w:val="554400"/>
-          <w:sz w:val="20"/>
-          <w:lang w:val="es-ES"/>
-        </w:rPr>
-        <w:t>SLOs</w:t>
-      </w:r>
-      <w:proofErr w:type="spellEnd"/>
-      <w:r>
-        <w:rPr>
-          <w:rFonts w:ascii="Calibri" w:hAnsi="Calibri"/>
-          <w:i/>
-          <w:color w:val="554400"/>
-          <w:sz w:val="20"/>
-          <w:lang w:val="es-ES"/>
-        </w:rPr>
-        <w:t xml:space="preserve"> de SERVICIO (disponibilidad, latencia, error </w:t>
-      </w:r>
-      <w:proofErr w:type="spellStart"/>
-      <w:r>
-        <w:rPr>
-          <w:rFonts w:ascii="Calibri" w:hAnsi="Calibri"/>
-          <w:i/>
-          <w:color w:val="554400"/>
-          <w:sz w:val="20"/>
-          <w:lang w:val="es-ES"/>
-        </w:rPr>
-        <w:t>rate</w:t>
-      </w:r>
-      <w:proofErr w:type="spellEnd"/>
-      <w:r>
-        <w:rPr>
-          <w:rFonts w:ascii="Calibri" w:hAnsi="Calibri"/>
-          <w:i/>
-          <w:color w:val="554400"/>
-          <w:sz w:val="20"/>
-          <w:lang w:val="es-ES"/>
-        </w:rPr>
-        <w:t xml:space="preserve"> del API) y (b) monitoreo de MODELO (</w:t>
-      </w:r>
-      <w:proofErr w:type="spellStart"/>
-      <w:r>
-        <w:rPr>
-          <w:rFonts w:ascii="Calibri" w:hAnsi="Calibri"/>
-          <w:i/>
-          <w:color w:val="554400"/>
-          <w:sz w:val="20"/>
-          <w:lang w:val="es-ES"/>
-        </w:rPr>
-        <w:t>drift</w:t>
-      </w:r>
-      <w:proofErr w:type="spellEnd"/>
-      <w:r>
-        <w:rPr>
-          <w:rFonts w:ascii="Calibri" w:hAnsi="Calibri"/>
-          <w:i/>
-          <w:color w:val="554400"/>
-          <w:sz w:val="20"/>
-          <w:lang w:val="es-ES"/>
-        </w:rPr>
-        <w:t>, degradación de RMSE). Son categorías distintas con métricas, umbrales y acciones diferentes.</w:t>
-      </w:r>
     </w:p>
     <w:p>
       <w:pPr>
@@ -15100,6 +15264,7 @@
                 <w:sz w:val="20"/>
                 <w:lang w:val="es-ES"/>
               </w:rPr>
+              <w:lastRenderedPageBreak/>
               <w:t>Latencia P99</w:t>
             </w:r>
           </w:p>
@@ -15763,6 +15928,18 @@
       <w:pPr>
         <w:spacing w:before="240" w:after="60"/>
         <w:rPr>
+          <w:rFonts w:ascii="Calibri" w:hAnsi="Calibri"/>
+          <w:b/>
+          <w:color w:val="003987"/>
+          <w:sz w:val="24"/>
+          <w:lang w:val="es-ES"/>
+        </w:rPr>
+      </w:pPr>
+    </w:p>
+    <w:p>
+      <w:pPr>
+        <w:spacing w:before="240" w:after="60"/>
+        <w:rPr>
           <w:lang w:val="es-ES"/>
         </w:rPr>
       </w:pPr>
@@ -16256,6 +16433,18 @@
         </w:rPr>
         <w:t xml:space="preserve"> &lt; 0.05.</w:t>
       </w:r>
+    </w:p>
+    <w:p>
+      <w:pPr>
+        <w:spacing w:before="240" w:after="60"/>
+        <w:rPr>
+          <w:rFonts w:ascii="Calibri" w:hAnsi="Calibri"/>
+          <w:b/>
+          <w:color w:val="003987"/>
+          <w:sz w:val="24"/>
+          <w:lang w:val="es-ES"/>
+        </w:rPr>
+      </w:pPr>
     </w:p>
     <w:p>
       <w:pPr>
@@ -16927,7 +17116,6 @@
                 <w:sz w:val="20"/>
                 <w:lang w:val="es-ES"/>
               </w:rPr>
-              <w:lastRenderedPageBreak/>
               <w:t>Servicio caído</w:t>
             </w:r>
           </w:p>
@@ -17609,6 +17797,7 @@
           <w:sz w:val="28"/>
           <w:lang w:val="es-ES"/>
         </w:rPr>
+        <w:lastRenderedPageBreak/>
         <w:t xml:space="preserve">6. Objetivo 4.5 — Seguridad, PII y </w:t>
       </w:r>
       <w:proofErr w:type="spellStart"/>
@@ -17623,6 +17812,18 @@
         <w:t>Compliance</w:t>
       </w:r>
       <w:proofErr w:type="spellEnd"/>
+    </w:p>
+    <w:p>
+      <w:pPr>
+        <w:spacing w:before="240" w:after="60"/>
+        <w:rPr>
+          <w:rFonts w:ascii="Calibri" w:hAnsi="Calibri"/>
+          <w:b/>
+          <w:color w:val="003987"/>
+          <w:sz w:val="24"/>
+          <w:lang w:val="es-ES"/>
+        </w:rPr>
+      </w:pPr>
     </w:p>
     <w:p>
       <w:pPr>
@@ -18808,6 +19009,18 @@
       <w:pPr>
         <w:spacing w:before="240" w:after="60"/>
         <w:rPr>
+          <w:rFonts w:ascii="Calibri" w:hAnsi="Calibri"/>
+          <w:b/>
+          <w:color w:val="003987"/>
+          <w:sz w:val="24"/>
+          <w:lang w:val="es-ES"/>
+        </w:rPr>
+      </w:pPr>
+    </w:p>
+    <w:p>
+      <w:pPr>
+        <w:spacing w:before="240" w:after="60"/>
+        <w:rPr>
           <w:lang w:val="es-ES"/>
         </w:rPr>
       </w:pPr>
@@ -19787,18 +20000,29 @@
       <w:pPr>
         <w:spacing w:before="240" w:after="60"/>
         <w:rPr>
-          <w:lang w:val="es-ES"/>
-        </w:rPr>
-      </w:pPr>
-      <w:r>
-        <w:rPr>
           <w:rFonts w:ascii="Calibri" w:hAnsi="Calibri"/>
           <w:b/>
           <w:color w:val="003987"/>
           <w:sz w:val="24"/>
           <w:lang w:val="es-ES"/>
         </w:rPr>
-        <w:lastRenderedPageBreak/>
+      </w:pPr>
+    </w:p>
+    <w:p>
+      <w:pPr>
+        <w:spacing w:before="240" w:after="60"/>
+        <w:rPr>
+          <w:lang w:val="es-ES"/>
+        </w:rPr>
+      </w:pPr>
+      <w:r>
+        <w:rPr>
+          <w:rFonts w:ascii="Calibri" w:hAnsi="Calibri"/>
+          <w:b/>
+          <w:color w:val="003987"/>
+          <w:sz w:val="24"/>
+          <w:lang w:val="es-ES"/>
+        </w:rPr>
         <w:t>6.3 Controles de Seguridad por Capa</w:t>
       </w:r>
     </w:p>
@@ -19889,6 +20113,7 @@
           <w:color w:val="000000"/>
           <w:lang w:val="es-ES"/>
         </w:rPr>
+        <w:lastRenderedPageBreak/>
         <w:t>Rate</w:t>
       </w:r>
       <w:proofErr w:type="spellEnd"/>
@@ -20384,6 +20609,18 @@
         </w:rPr>
         <w:t xml:space="preserve"> con hash del modelo usado, para auditabilidad.</w:t>
       </w:r>
+    </w:p>
+    <w:p>
+      <w:pPr>
+        <w:spacing w:before="240" w:after="60"/>
+        <w:rPr>
+          <w:rFonts w:ascii="Calibri" w:hAnsi="Calibri"/>
+          <w:b/>
+          <w:color w:val="003987"/>
+          <w:sz w:val="24"/>
+          <w:lang w:val="es-ES"/>
+        </w:rPr>
+      </w:pPr>
     </w:p>
     <w:p>
       <w:pPr>
@@ -21129,6 +21366,18 @@
         </w:rPr>
         <w:t xml:space="preserve"> aplicable.</w:t>
       </w:r>
+    </w:p>
+    <w:p>
+      <w:pPr>
+        <w:spacing w:before="240" w:after="60"/>
+        <w:rPr>
+          <w:rFonts w:ascii="Calibri" w:hAnsi="Calibri"/>
+          <w:b/>
+          <w:color w:val="003987"/>
+          <w:sz w:val="24"/>
+          <w:lang w:val="es-ES"/>
+        </w:rPr>
+      </w:pPr>
     </w:p>
     <w:p>
       <w:pPr>
@@ -22397,6 +22646,21 @@
         </w:pBdr>
         <w:spacing w:before="360" w:after="80"/>
         <w:rPr>
+          <w:rFonts w:ascii="Calibri" w:hAnsi="Calibri"/>
+          <w:b/>
+          <w:color w:val="003987"/>
+          <w:sz w:val="28"/>
+          <w:lang w:val="es-ES"/>
+        </w:rPr>
+      </w:pPr>
+    </w:p>
+    <w:p>
+      <w:pPr>
+        <w:pBdr>
+          <w:bottom w:val="single" w:sz="6" w:space="1" w:color="003987"/>
+        </w:pBdr>
+        <w:spacing w:before="360" w:after="80"/>
+        <w:rPr>
           <w:lang w:val="es-ES"/>
         </w:rPr>
       </w:pPr>
@@ -23653,6 +23917,7 @@
                 <w:sz w:val="20"/>
                 <w:lang w:val="es-ES"/>
               </w:rPr>
+              <w:lastRenderedPageBreak/>
               <w:t>variables.tf</w:t>
             </w:r>
           </w:p>
@@ -23836,18 +24101,29 @@
       <w:pPr>
         <w:spacing w:before="240" w:after="60"/>
         <w:rPr>
-          <w:lang w:val="es-ES"/>
-        </w:rPr>
-      </w:pPr>
-      <w:r>
-        <w:rPr>
           <w:rFonts w:ascii="Calibri" w:hAnsi="Calibri"/>
           <w:b/>
           <w:color w:val="003987"/>
           <w:sz w:val="24"/>
           <w:lang w:val="es-ES"/>
         </w:rPr>
-        <w:lastRenderedPageBreak/>
+      </w:pPr>
+    </w:p>
+    <w:p>
+      <w:pPr>
+        <w:spacing w:before="240" w:after="60"/>
+        <w:rPr>
+          <w:lang w:val="es-ES"/>
+        </w:rPr>
+      </w:pPr>
+      <w:r>
+        <w:rPr>
+          <w:rFonts w:ascii="Calibri" w:hAnsi="Calibri"/>
+          <w:b/>
+          <w:color w:val="003987"/>
+          <w:sz w:val="24"/>
+          <w:lang w:val="es-ES"/>
+        </w:rPr>
         <w:t xml:space="preserve">7.2 </w:t>
       </w:r>
       <w:proofErr w:type="spellStart"/>
@@ -25080,6 +25356,18 @@
       <w:pPr>
         <w:spacing w:before="240" w:after="60"/>
         <w:rPr>
+          <w:rFonts w:ascii="Calibri" w:hAnsi="Calibri"/>
+          <w:b/>
+          <w:color w:val="003987"/>
+          <w:sz w:val="24"/>
+          <w:lang w:val="es-ES"/>
+        </w:rPr>
+      </w:pPr>
+    </w:p>
+    <w:p>
+      <w:pPr>
+        <w:spacing w:before="240" w:after="60"/>
+        <w:rPr>
           <w:lang w:val="es-ES"/>
         </w:rPr>
       </w:pPr>
@@ -25845,6 +26133,7 @@
           <w:sz w:val="24"/>
           <w:lang w:val="es-ES"/>
         </w:rPr>
+        <w:lastRenderedPageBreak/>
         <w:t xml:space="preserve">7.4 Criterios de Aceptación del </w:t>
       </w:r>
       <w:proofErr w:type="spellStart"/>
@@ -26090,7 +26379,6 @@
           <w:color w:val="000000"/>
           <w:lang w:val="es-ES"/>
         </w:rPr>
-        <w:lastRenderedPageBreak/>
         <w:t xml:space="preserve">Firma del Acta de Entrega por parte del </w:t>
       </w:r>
       <w:proofErr w:type="gramStart"/>
@@ -26111,6 +26399,18 @@
         </w:rPr>
         <w:t xml:space="preserve"> y del líder del Equipo 48.</w:t>
       </w:r>
+    </w:p>
+    <w:p>
+      <w:pPr>
+        <w:spacing w:before="240" w:after="60"/>
+        <w:rPr>
+          <w:rFonts w:ascii="Calibri" w:hAnsi="Calibri"/>
+          <w:b/>
+          <w:color w:val="003987"/>
+          <w:sz w:val="24"/>
+          <w:lang w:val="es-ES"/>
+        </w:rPr>
+      </w:pPr>
     </w:p>
     <w:p>
       <w:pPr>
@@ -27235,17 +27535,93 @@
         </w:pBdr>
         <w:spacing w:before="360" w:after="80"/>
         <w:rPr>
-          <w:lang w:val="es-ES"/>
-        </w:rPr>
-      </w:pPr>
-      <w:r>
-        <w:rPr>
           <w:rFonts w:ascii="Calibri" w:hAnsi="Calibri"/>
           <w:b/>
           <w:color w:val="003987"/>
           <w:sz w:val="28"/>
           <w:lang w:val="es-ES"/>
         </w:rPr>
+      </w:pPr>
+    </w:p>
+    <w:p>
+      <w:pPr>
+        <w:pBdr>
+          <w:bottom w:val="single" w:sz="6" w:space="1" w:color="003987"/>
+        </w:pBdr>
+        <w:spacing w:before="360" w:after="80"/>
+        <w:rPr>
+          <w:rFonts w:ascii="Calibri" w:hAnsi="Calibri"/>
+          <w:b/>
+          <w:color w:val="003987"/>
+          <w:sz w:val="28"/>
+          <w:lang w:val="es-ES"/>
+        </w:rPr>
+      </w:pPr>
+    </w:p>
+    <w:p>
+      <w:pPr>
+        <w:pBdr>
+          <w:bottom w:val="single" w:sz="6" w:space="1" w:color="003987"/>
+        </w:pBdr>
+        <w:spacing w:before="360" w:after="80"/>
+        <w:rPr>
+          <w:rFonts w:ascii="Calibri" w:hAnsi="Calibri"/>
+          <w:b/>
+          <w:color w:val="003987"/>
+          <w:sz w:val="28"/>
+          <w:lang w:val="es-ES"/>
+        </w:rPr>
+      </w:pPr>
+    </w:p>
+    <w:p>
+      <w:pPr>
+        <w:pBdr>
+          <w:bottom w:val="single" w:sz="6" w:space="1" w:color="003987"/>
+        </w:pBdr>
+        <w:spacing w:before="360" w:after="80"/>
+        <w:rPr>
+          <w:rFonts w:ascii="Calibri" w:hAnsi="Calibri"/>
+          <w:b/>
+          <w:color w:val="003987"/>
+          <w:sz w:val="28"/>
+          <w:lang w:val="es-ES"/>
+        </w:rPr>
+      </w:pPr>
+    </w:p>
+    <w:p>
+      <w:pPr>
+        <w:pBdr>
+          <w:bottom w:val="single" w:sz="6" w:space="1" w:color="003987"/>
+        </w:pBdr>
+        <w:spacing w:before="360" w:after="80"/>
+        <w:rPr>
+          <w:rFonts w:ascii="Calibri" w:hAnsi="Calibri"/>
+          <w:b/>
+          <w:color w:val="003987"/>
+          <w:sz w:val="28"/>
+          <w:lang w:val="es-ES"/>
+        </w:rPr>
+      </w:pPr>
+    </w:p>
+    <w:p>
+      <w:pPr>
+        <w:pBdr>
+          <w:bottom w:val="single" w:sz="6" w:space="1" w:color="003987"/>
+        </w:pBdr>
+        <w:spacing w:before="360" w:after="80"/>
+        <w:rPr>
+          <w:lang w:val="es-ES"/>
+        </w:rPr>
+      </w:pPr>
+      <w:r>
+        <w:rPr>
+          <w:rFonts w:ascii="Calibri" w:hAnsi="Calibri"/>
+          <w:b/>
+          <w:color w:val="003987"/>
+          <w:sz w:val="28"/>
+          <w:lang w:val="es-ES"/>
+        </w:rPr>
+        <w:lastRenderedPageBreak/>
         <w:t xml:space="preserve">8. </w:t>
       </w:r>
       <w:proofErr w:type="gramStart"/>
@@ -27694,7 +28070,6 @@
           <w:color w:val="003987"/>
           <w:lang w:val="es-ES"/>
         </w:rPr>
-        <w:lastRenderedPageBreak/>
         <w:t xml:space="preserve">6. Impacto práctico y ROI: </w:t>
       </w:r>
       <w:r>

</xml_diff>